<commit_message>
Intro slide 'What is video anomaly detection?' (real ShanghaiTech frames + detector score curve), notes shifted; script gains page 1 section, renumbered, clocks to 19:05
</commit_message>
<xml_diff>
--- a/docs/06_presentations/DA-ZVAD_Presentation_Script_Oct2026.docx
+++ b/docs/06_presentations/DA-ZVAD_Presentation_Script_Oct2026.docx
@@ -607,7 +607,7 @@
                 <w:color w:val="3A4A4C"/>
                 <w:sz w:val="18"/>
               </w:rPr>
-              <w:t>The problem</w:t>
+              <w:t>What is video anomaly detection?</w:t>
             </w:r>
           </w:p>
         </w:tc>
@@ -629,7 +629,7 @@
                 <w:color w:val="3A4A4C"/>
                 <w:sz w:val="18"/>
               </w:rPr>
-              <w:t>45 s</w:t>
+              <w:t>35 s</w:t>
             </w:r>
           </w:p>
         </w:tc>
@@ -651,7 +651,7 @@
                 <w:color w:val="3A4A4C"/>
                 <w:sz w:val="18"/>
               </w:rPr>
-              <w:t>1:05</w:t>
+              <w:t>0:55</w:t>
             </w:r>
           </w:p>
         </w:tc>
@@ -697,7 +697,7 @@
                 <w:color w:val="3A4A4C"/>
                 <w:sz w:val="18"/>
               </w:rPr>
-              <w:t>Research gap 1</w:t>
+              <w:t>The problem</w:t>
             </w:r>
           </w:p>
         </w:tc>
@@ -719,7 +719,7 @@
                 <w:color w:val="3A4A4C"/>
                 <w:sz w:val="18"/>
               </w:rPr>
-              <w:t>50 s</w:t>
+              <w:t>45 s</w:t>
             </w:r>
           </w:p>
         </w:tc>
@@ -741,7 +741,7 @@
                 <w:color w:val="3A4A4C"/>
                 <w:sz w:val="18"/>
               </w:rPr>
-              <w:t>1:55</w:t>
+              <w:t>1:40</w:t>
             </w:r>
           </w:p>
         </w:tc>
@@ -787,7 +787,7 @@
                 <w:color w:val="3A4A4C"/>
                 <w:sz w:val="18"/>
               </w:rPr>
-              <w:t>Research gap 2</w:t>
+              <w:t>Research gap 1</w:t>
             </w:r>
           </w:p>
         </w:tc>
@@ -809,7 +809,7 @@
                 <w:color w:val="3A4A4C"/>
                 <w:sz w:val="18"/>
               </w:rPr>
-              <w:t>40 s</w:t>
+              <w:t>50 s</w:t>
             </w:r>
           </w:p>
         </w:tc>
@@ -831,7 +831,7 @@
                 <w:color w:val="3A4A4C"/>
                 <w:sz w:val="18"/>
               </w:rPr>
-              <w:t>2:35</w:t>
+              <w:t>2:30</w:t>
             </w:r>
           </w:p>
         </w:tc>
@@ -877,7 +877,7 @@
                 <w:color w:val="3A4A4C"/>
                 <w:sz w:val="18"/>
               </w:rPr>
-              <w:t>The framework (diagram)</w:t>
+              <w:t>Research gap 2</w:t>
             </w:r>
           </w:p>
         </w:tc>
@@ -899,7 +899,7 @@
                 <w:color w:val="3A4A4C"/>
                 <w:sz w:val="18"/>
               </w:rPr>
-              <w:t>2 min</w:t>
+              <w:t>40 s</w:t>
             </w:r>
           </w:p>
         </w:tc>
@@ -921,7 +921,7 @@
                 <w:color w:val="3A4A4C"/>
                 <w:sz w:val="18"/>
               </w:rPr>
-              <w:t>4:35</w:t>
+              <w:t>3:10</w:t>
             </w:r>
           </w:p>
         </w:tc>
@@ -967,7 +967,7 @@
                 <w:color w:val="3A4A4C"/>
                 <w:sz w:val="18"/>
               </w:rPr>
-              <w:t>Why everything is frozen</w:t>
+              <w:t>The framework diagram</w:t>
             </w:r>
           </w:p>
         </w:tc>
@@ -989,7 +989,7 @@
                 <w:color w:val="3A4A4C"/>
                 <w:sz w:val="18"/>
               </w:rPr>
-              <w:t>40 s</w:t>
+              <w:t>2 min</w:t>
             </w:r>
           </w:p>
         </w:tc>
@@ -1011,7 +1011,7 @@
                 <w:color w:val="3A4A4C"/>
                 <w:sz w:val="18"/>
               </w:rPr>
-              <w:t>5:15</w:t>
+              <w:t>5:10</w:t>
             </w:r>
           </w:p>
         </w:tc>
@@ -1057,7 +1057,7 @@
                 <w:color w:val="3A4A4C"/>
                 <w:sz w:val="18"/>
               </w:rPr>
-              <w:t>The protocol</w:t>
+              <w:t>Why everything is frozen</w:t>
             </w:r>
           </w:p>
         </w:tc>
@@ -1101,7 +1101,7 @@
                 <w:color w:val="3A4A4C"/>
                 <w:sz w:val="18"/>
               </w:rPr>
-              <w:t>5:55</w:t>
+              <w:t>5:50</w:t>
             </w:r>
           </w:p>
         </w:tc>
@@ -1147,7 +1147,7 @@
                 <w:color w:val="3A4A4C"/>
                 <w:sz w:val="18"/>
               </w:rPr>
-              <w:t>What we ran</w:t>
+              <w:t>The protocol</w:t>
             </w:r>
           </w:p>
         </w:tc>
@@ -1169,7 +1169,7 @@
                 <w:color w:val="3A4A4C"/>
                 <w:sz w:val="18"/>
               </w:rPr>
-              <w:t>25 s</w:t>
+              <w:t>40 s</w:t>
             </w:r>
           </w:p>
         </w:tc>
@@ -1191,7 +1191,7 @@
                 <w:color w:val="3A4A4C"/>
                 <w:sz w:val="18"/>
               </w:rPr>
-              <w:t>6:20</w:t>
+              <w:t>6:30</w:t>
             </w:r>
           </w:p>
         </w:tc>
@@ -1237,7 +1237,7 @@
                 <w:color w:val="3A4A4C"/>
                 <w:sz w:val="18"/>
               </w:rPr>
-              <w:t>What the data looks like</w:t>
+              <w:t>What we ran</w:t>
             </w:r>
           </w:p>
         </w:tc>
@@ -1259,7 +1259,7 @@
                 <w:color w:val="3A4A4C"/>
                 <w:sz w:val="18"/>
               </w:rPr>
-              <w:t>20 s</w:t>
+              <w:t>25 s</w:t>
             </w:r>
           </w:p>
         </w:tc>
@@ -1281,7 +1281,7 @@
                 <w:color w:val="3A4A4C"/>
                 <w:sz w:val="18"/>
               </w:rPr>
-              <w:t>6:40</w:t>
+              <w:t>6:55</w:t>
             </w:r>
           </w:p>
         </w:tc>
@@ -1327,7 +1327,7 @@
                 <w:color w:val="3A4A4C"/>
                 <w:sz w:val="18"/>
               </w:rPr>
-              <w:t>The first result failed</w:t>
+              <w:t>What the data looks like</w:t>
             </w:r>
           </w:p>
         </w:tc>
@@ -1349,7 +1349,7 @@
                 <w:color w:val="3A4A4C"/>
                 <w:sz w:val="18"/>
               </w:rPr>
-              <w:t>30 s</w:t>
+              <w:t>20 s</w:t>
             </w:r>
           </w:p>
         </w:tc>
@@ -1371,7 +1371,7 @@
                 <w:color w:val="3A4A4C"/>
                 <w:sz w:val="18"/>
               </w:rPr>
-              <w:t>7:10</w:t>
+              <w:t>7:15</w:t>
             </w:r>
           </w:p>
         </w:tc>
@@ -1417,7 +1417,7 @@
                 <w:color w:val="3A4A4C"/>
                 <w:sz w:val="18"/>
               </w:rPr>
-              <w:t>Diagnosis 1</w:t>
+              <w:t>The first result failed</w:t>
             </w:r>
           </w:p>
         </w:tc>
@@ -1439,7 +1439,7 @@
                 <w:color w:val="3A4A4C"/>
                 <w:sz w:val="18"/>
               </w:rPr>
-              <w:t>45 s</w:t>
+              <w:t>30 s</w:t>
             </w:r>
           </w:p>
         </w:tc>
@@ -1461,7 +1461,7 @@
                 <w:color w:val="3A4A4C"/>
                 <w:sz w:val="18"/>
               </w:rPr>
-              <w:t>7:55</w:t>
+              <w:t>7:45</w:t>
             </w:r>
           </w:p>
         </w:tc>
@@ -1507,7 +1507,7 @@
                 <w:color w:val="3A4A4C"/>
                 <w:sz w:val="18"/>
               </w:rPr>
-              <w:t>The evidence</w:t>
+              <w:t>Diagnosis 1</w:t>
             </w:r>
           </w:p>
         </w:tc>
@@ -1529,7 +1529,7 @@
                 <w:color w:val="3A4A4C"/>
                 <w:sz w:val="18"/>
               </w:rPr>
-              <w:t>20 s</w:t>
+              <w:t>45 s</w:t>
             </w:r>
           </w:p>
         </w:tc>
@@ -1551,7 +1551,7 @@
                 <w:color w:val="3A4A4C"/>
                 <w:sz w:val="18"/>
               </w:rPr>
-              <w:t>8:15</w:t>
+              <w:t>8:30</w:t>
             </w:r>
           </w:p>
         </w:tc>
@@ -1597,7 +1597,7 @@
                 <w:color w:val="3A4A4C"/>
                 <w:sz w:val="18"/>
               </w:rPr>
-              <w:t>Diagnosis 2</w:t>
+              <w:t>The evidence</w:t>
             </w:r>
           </w:p>
         </w:tc>
@@ -1619,7 +1619,7 @@
                 <w:color w:val="3A4A4C"/>
                 <w:sz w:val="18"/>
               </w:rPr>
-              <w:t>50 s</w:t>
+              <w:t>20 s</w:t>
             </w:r>
           </w:p>
         </w:tc>
@@ -1641,7 +1641,7 @@
                 <w:color w:val="3A4A4C"/>
                 <w:sz w:val="18"/>
               </w:rPr>
-              <w:t>9:05</w:t>
+              <w:t>8:50</w:t>
             </w:r>
           </w:p>
         </w:tc>
@@ -1687,7 +1687,7 @@
                 <w:color w:val="3A4A4C"/>
                 <w:sz w:val="18"/>
               </w:rPr>
-              <w:t>After the fix</w:t>
+              <w:t>Diagnosis 2</w:t>
             </w:r>
           </w:p>
         </w:tc>
@@ -1709,7 +1709,7 @@
                 <w:color w:val="3A4A4C"/>
                 <w:sz w:val="18"/>
               </w:rPr>
-              <w:t>45 s</w:t>
+              <w:t>50 s</w:t>
             </w:r>
           </w:p>
         </w:tc>
@@ -1731,7 +1731,7 @@
                 <w:color w:val="3A4A4C"/>
                 <w:sz w:val="18"/>
               </w:rPr>
-              <w:t>9:50</w:t>
+              <w:t>9:40</w:t>
             </w:r>
           </w:p>
         </w:tc>
@@ -1777,7 +1777,7 @@
                 <w:color w:val="3A4A4C"/>
                 <w:sz w:val="18"/>
               </w:rPr>
-              <w:t>Same, drawn</w:t>
+              <w:t>After the fix</w:t>
             </w:r>
           </w:p>
         </w:tc>
@@ -1799,7 +1799,7 @@
                 <w:color w:val="3A4A4C"/>
                 <w:sz w:val="18"/>
               </w:rPr>
-              <w:t>15 s</w:t>
+              <w:t>45 s</w:t>
             </w:r>
           </w:p>
         </w:tc>
@@ -1821,7 +1821,7 @@
                 <w:color w:val="3A4A4C"/>
                 <w:sz w:val="18"/>
               </w:rPr>
-              <w:t>10:05</w:t>
+              <w:t>10:25</w:t>
             </w:r>
           </w:p>
         </w:tc>
@@ -1867,7 +1867,7 @@
                 <w:color w:val="3A4A4C"/>
                 <w:sz w:val="18"/>
               </w:rPr>
-              <w:t>One clip</w:t>
+              <w:t>Same, drawn</w:t>
             </w:r>
           </w:p>
         </w:tc>
@@ -1889,7 +1889,7 @@
                 <w:color w:val="3A4A4C"/>
                 <w:sz w:val="18"/>
               </w:rPr>
-              <w:t>20 s</w:t>
+              <w:t>15 s</w:t>
             </w:r>
           </w:p>
         </w:tc>
@@ -1911,7 +1911,7 @@
                 <w:color w:val="3A4A4C"/>
                 <w:sz w:val="18"/>
               </w:rPr>
-              <w:t>10:25</w:t>
+              <w:t>10:40</w:t>
             </w:r>
           </w:p>
         </w:tc>
@@ -1957,7 +1957,7 @@
                 <w:color w:val="3A4A4C"/>
                 <w:sz w:val="18"/>
               </w:rPr>
-              <w:t>Stating the claim precisely</w:t>
+              <w:t>One clip</w:t>
             </w:r>
           </w:p>
         </w:tc>
@@ -1979,7 +1979,7 @@
                 <w:color w:val="3A4A4C"/>
                 <w:sz w:val="18"/>
               </w:rPr>
-              <w:t>50 s</w:t>
+              <w:t>20 s</w:t>
             </w:r>
           </w:p>
         </w:tc>
@@ -2001,7 +2001,7 @@
                 <w:color w:val="3A4A4C"/>
                 <w:sz w:val="18"/>
               </w:rPr>
-              <w:t>11:15</w:t>
+              <w:t>11:00</w:t>
             </w:r>
           </w:p>
         </w:tc>
@@ -2047,7 +2047,7 @@
                 <w:color w:val="3A4A4C"/>
                 <w:sz w:val="18"/>
               </w:rPr>
-              <w:t>Components</w:t>
+              <w:t>Stating the claim precisely</w:t>
             </w:r>
           </w:p>
         </w:tc>
@@ -2069,7 +2069,7 @@
                 <w:color w:val="3A4A4C"/>
                 <w:sz w:val="18"/>
               </w:rPr>
-              <w:t>30 s</w:t>
+              <w:t>50 s</w:t>
             </w:r>
           </w:p>
         </w:tc>
@@ -2091,7 +2091,7 @@
                 <w:color w:val="3A4A4C"/>
                 <w:sz w:val="18"/>
               </w:rPr>
-              <w:t>11:45</w:t>
+              <w:t>11:50</w:t>
             </w:r>
           </w:p>
         </w:tc>
@@ -2137,7 +2137,7 @@
                 <w:color w:val="3A4A4C"/>
                 <w:sz w:val="18"/>
               </w:rPr>
-              <w:t>Window chart</w:t>
+              <w:t>Components</w:t>
             </w:r>
           </w:p>
         </w:tc>
@@ -2159,7 +2159,7 @@
                 <w:color w:val="3A4A4C"/>
                 <w:sz w:val="18"/>
               </w:rPr>
-              <w:t>15 s</w:t>
+              <w:t>30 s</w:t>
             </w:r>
           </w:p>
         </w:tc>
@@ -2181,7 +2181,7 @@
                 <w:color w:val="3A4A4C"/>
                 <w:sz w:val="18"/>
               </w:rPr>
-              <w:t>12:00</w:t>
+              <w:t>12:20</w:t>
             </w:r>
           </w:p>
         </w:tc>
@@ -2227,7 +2227,7 @@
                 <w:color w:val="3A4A4C"/>
                 <w:sz w:val="18"/>
               </w:rPr>
-              <w:t>Second dataset (Avenue)</w:t>
+              <w:t>Window chart</w:t>
             </w:r>
           </w:p>
         </w:tc>
@@ -2249,7 +2249,7 @@
                 <w:color w:val="3A4A4C"/>
                 <w:sz w:val="18"/>
               </w:rPr>
-              <w:t>45 s</w:t>
+              <w:t>15 s</w:t>
             </w:r>
           </w:p>
         </w:tc>
@@ -2271,7 +2271,7 @@
                 <w:color w:val="3A4A4C"/>
                 <w:sz w:val="18"/>
               </w:rPr>
-              <w:t>12:45</w:t>
+              <w:t>12:35</w:t>
             </w:r>
           </w:p>
         </w:tc>
@@ -2317,7 +2317,7 @@
                 <w:color w:val="3A4A4C"/>
                 <w:sz w:val="18"/>
               </w:rPr>
-              <w:t>Testing the explanation</w:t>
+              <w:t>Second dataset (Avenue)</w:t>
             </w:r>
           </w:p>
         </w:tc>
@@ -2339,7 +2339,7 @@
                 <w:color w:val="3A4A4C"/>
                 <w:sz w:val="18"/>
               </w:rPr>
-              <w:t>40 s</w:t>
+              <w:t>45 s</w:t>
             </w:r>
           </w:p>
         </w:tc>
@@ -2361,7 +2361,7 @@
                 <w:color w:val="3A4A4C"/>
                 <w:sz w:val="18"/>
               </w:rPr>
-              <w:t>13:25</w:t>
+              <w:t>13:20</w:t>
             </w:r>
           </w:p>
         </w:tc>
@@ -2407,7 +2407,7 @@
                 <w:color w:val="3A4A4C"/>
                 <w:sz w:val="18"/>
               </w:rPr>
-              <w:t>Every camera view</w:t>
+              <w:t>Testing the explanation</w:t>
             </w:r>
           </w:p>
         </w:tc>
@@ -2429,7 +2429,7 @@
                 <w:color w:val="3A4A4C"/>
                 <w:sz w:val="18"/>
               </w:rPr>
-              <w:t>15 s</w:t>
+              <w:t>40 s</w:t>
             </w:r>
           </w:p>
         </w:tc>
@@ -2451,7 +2451,7 @@
                 <w:color w:val="3A4A4C"/>
                 <w:sz w:val="18"/>
               </w:rPr>
-              <w:t>13:40</w:t>
+              <w:t>14:00</w:t>
             </w:r>
           </w:p>
         </w:tc>
@@ -2497,7 +2497,7 @@
                 <w:color w:val="3A4A4C"/>
                 <w:sz w:val="18"/>
               </w:rPr>
-              <w:t>A sentence per camera</w:t>
+              <w:t>Every camera view</w:t>
             </w:r>
           </w:p>
         </w:tc>
@@ -2519,7 +2519,7 @@
                 <w:color w:val="3A4A4C"/>
                 <w:sz w:val="18"/>
               </w:rPr>
-              <w:t>45 s</w:t>
+              <w:t>15 s</w:t>
             </w:r>
           </w:p>
         </w:tc>
@@ -2541,7 +2541,7 @@
                 <w:color w:val="3A4A4C"/>
                 <w:sz w:val="18"/>
               </w:rPr>
-              <w:t>14:25</w:t>
+              <w:t>14:15</w:t>
             </w:r>
           </w:p>
         </w:tc>
@@ -2587,7 +2587,7 @@
                 <w:color w:val="3A4A4C"/>
                 <w:sz w:val="18"/>
               </w:rPr>
-              <w:t>UCF-Crime predictions</w:t>
+              <w:t>A sentence per camera</w:t>
             </w:r>
           </w:p>
         </w:tc>
@@ -2609,7 +2609,7 @@
                 <w:color w:val="3A4A4C"/>
                 <w:sz w:val="18"/>
               </w:rPr>
-              <w:t>60 s</w:t>
+              <w:t>45 s</w:t>
             </w:r>
           </w:p>
         </w:tc>
@@ -2631,7 +2631,7 @@
                 <w:color w:val="3A4A4C"/>
                 <w:sz w:val="18"/>
               </w:rPr>
-              <w:t>15:25</w:t>
+              <w:t>15:00</w:t>
             </w:r>
           </w:p>
         </w:tc>
@@ -2677,7 +2677,7 @@
                 <w:color w:val="3A4A4C"/>
                 <w:sz w:val="18"/>
               </w:rPr>
-              <w:t>UCF-Crime drawn</w:t>
+              <w:t>UCF-Crime predictions</w:t>
             </w:r>
           </w:p>
         </w:tc>
@@ -2699,7 +2699,7 @@
                 <w:color w:val="3A4A4C"/>
                 <w:sz w:val="18"/>
               </w:rPr>
-              <w:t>20 s</w:t>
+              <w:t>60 s</w:t>
             </w:r>
           </w:p>
         </w:tc>
@@ -2721,7 +2721,7 @@
                 <w:color w:val="3A4A4C"/>
                 <w:sz w:val="18"/>
               </w:rPr>
-              <w:t>15:45</w:t>
+              <w:t>16:00</w:t>
             </w:r>
           </w:p>
         </w:tc>
@@ -2767,7 +2767,7 @@
                 <w:color w:val="3A4A4C"/>
                 <w:sz w:val="18"/>
               </w:rPr>
-              <w:t>Six things that failed</w:t>
+              <w:t>UCF-Crime drawn</w:t>
             </w:r>
           </w:p>
         </w:tc>
@@ -2789,7 +2789,7 @@
                 <w:color w:val="3A4A4C"/>
                 <w:sz w:val="18"/>
               </w:rPr>
-              <w:t>25 s</w:t>
+              <w:t>20 s</w:t>
             </w:r>
           </w:p>
         </w:tc>
@@ -2811,7 +2811,7 @@
                 <w:color w:val="3A4A4C"/>
                 <w:sz w:val="18"/>
               </w:rPr>
-              <w:t>16:10</w:t>
+              <w:t>16:20</w:t>
             </w:r>
           </w:p>
         </w:tc>
@@ -2857,7 +2857,7 @@
                 <w:color w:val="3A4A4C"/>
                 <w:sz w:val="18"/>
               </w:rPr>
-              <w:t>Against the literature</w:t>
+              <w:t>Six things that failed</w:t>
             </w:r>
           </w:p>
         </w:tc>
@@ -2879,7 +2879,7 @@
                 <w:color w:val="3A4A4C"/>
                 <w:sz w:val="18"/>
               </w:rPr>
-              <w:t>50 s</w:t>
+              <w:t>25 s</w:t>
             </w:r>
           </w:p>
         </w:tc>
@@ -2901,7 +2901,7 @@
                 <w:color w:val="3A4A4C"/>
                 <w:sz w:val="18"/>
               </w:rPr>
-              <w:t>17:00</w:t>
+              <w:t>16:45</w:t>
             </w:r>
           </w:p>
         </w:tc>
@@ -2947,7 +2947,7 @@
                 <w:color w:val="3A4A4C"/>
                 <w:sz w:val="18"/>
               </w:rPr>
-              <w:t>Limitations</w:t>
+              <w:t>Against the literature</w:t>
             </w:r>
           </w:p>
         </w:tc>
@@ -2969,7 +2969,7 @@
                 <w:color w:val="3A4A4C"/>
                 <w:sz w:val="18"/>
               </w:rPr>
-              <w:t>35 s</w:t>
+              <w:t>50 s</w:t>
             </w:r>
           </w:p>
         </w:tc>
@@ -3037,7 +3037,7 @@
                 <w:color w:val="3A4A4C"/>
                 <w:sz w:val="18"/>
               </w:rPr>
-              <w:t>What comes next</w:t>
+              <w:t>Limitations</w:t>
             </w:r>
           </w:p>
         </w:tc>
@@ -3059,7 +3059,7 @@
                 <w:color w:val="3A4A4C"/>
                 <w:sz w:val="18"/>
               </w:rPr>
-              <w:t>25 s</w:t>
+              <w:t>35 s</w:t>
             </w:r>
           </w:p>
         </w:tc>
@@ -3081,7 +3081,7 @@
                 <w:color w:val="3A4A4C"/>
                 <w:sz w:val="18"/>
               </w:rPr>
-              <w:t>18:00</w:t>
+              <w:t>18:10</w:t>
             </w:r>
           </w:p>
         </w:tc>
@@ -3127,7 +3127,7 @@
                 <w:color w:val="3A4A4C"/>
                 <w:sz w:val="18"/>
               </w:rPr>
-              <w:t>Summary</w:t>
+              <w:t>What comes next</w:t>
             </w:r>
           </w:p>
         </w:tc>
@@ -3149,7 +3149,7 @@
                 <w:color w:val="3A4A4C"/>
                 <w:sz w:val="18"/>
               </w:rPr>
-              <w:t>30 s</w:t>
+              <w:t>25 s</w:t>
             </w:r>
           </w:p>
         </w:tc>
@@ -3171,7 +3171,7 @@
                 <w:color w:val="3A4A4C"/>
                 <w:sz w:val="18"/>
               </w:rPr>
-              <w:t>18:30</w:t>
+              <w:t>18:35</w:t>
             </w:r>
           </w:p>
         </w:tc>
@@ -3195,7 +3195,7 @@
                 <w:color w:val="3A4A4C"/>
                 <w:sz w:val="18"/>
               </w:rPr>
-              <w:t>30–32</w:t>
+              <w:t>30</w:t>
             </w:r>
           </w:p>
         </w:tc>
@@ -3217,7 +3217,7 @@
                 <w:color w:val="3A4A4C"/>
                 <w:sz w:val="18"/>
               </w:rPr>
-              <w:t>References</w:t>
+              <w:t>Summary</w:t>
             </w:r>
           </w:p>
         </w:tc>
@@ -3239,6 +3239,96 @@
                 <w:color w:val="3A4A4C"/>
                 <w:sz w:val="18"/>
               </w:rPr>
+              <w:t>30 s</w:t>
+            </w:r>
+          </w:p>
+        </w:tc>
+        <w:tc>
+          <w:tcPr>
+            <w:tcW w:type="dxa" w:w="2329"/>
+            <w:shd w:val="clear" w:fill="F5F7F7"/>
+          </w:tcPr>
+          <w:p>
+            <w:pPr>
+              <w:spacing w:before="60" w:after="60"/>
+            </w:pPr>
+            <w:r/>
+            <w:r>
+              <w:rPr>
+                <w:rFonts w:ascii="Segoe UI" w:hAnsi="Segoe UI"/>
+                <w:b w:val="0"/>
+                <w:i w:val="0"/>
+                <w:color w:val="3A4A4C"/>
+                <w:sz w:val="18"/>
+              </w:rPr>
+              <w:t>19:05</w:t>
+            </w:r>
+          </w:p>
+        </w:tc>
+      </w:tr>
+      <w:tr>
+        <w:tc>
+          <w:tcPr>
+            <w:tcW w:type="dxa" w:w="2329"/>
+            <w:shd w:val="clear" w:fill="FFFFFF"/>
+          </w:tcPr>
+          <w:p>
+            <w:pPr>
+              <w:spacing w:before="60" w:after="60"/>
+            </w:pPr>
+            <w:r/>
+            <w:r>
+              <w:rPr>
+                <w:rFonts w:ascii="Segoe UI" w:hAnsi="Segoe UI"/>
+                <w:b w:val="0"/>
+                <w:i w:val="0"/>
+                <w:color w:val="3A4A4C"/>
+                <w:sz w:val="18"/>
+              </w:rPr>
+              <w:t>31–33</w:t>
+            </w:r>
+          </w:p>
+        </w:tc>
+        <w:tc>
+          <w:tcPr>
+            <w:tcW w:type="dxa" w:w="2329"/>
+            <w:shd w:val="clear" w:fill="FFFFFF"/>
+          </w:tcPr>
+          <w:p>
+            <w:pPr>
+              <w:spacing w:before="60" w:after="60"/>
+            </w:pPr>
+            <w:r/>
+            <w:r>
+              <w:rPr>
+                <w:rFonts w:ascii="Segoe UI" w:hAnsi="Segoe UI"/>
+                <w:b w:val="0"/>
+                <w:i w:val="0"/>
+                <w:color w:val="3A4A4C"/>
+                <w:sz w:val="18"/>
+              </w:rPr>
+              <w:t>References</w:t>
+            </w:r>
+          </w:p>
+        </w:tc>
+        <w:tc>
+          <w:tcPr>
+            <w:tcW w:type="dxa" w:w="2329"/>
+            <w:shd w:val="clear" w:fill="FFFFFF"/>
+          </w:tcPr>
+          <w:p>
+            <w:pPr>
+              <w:spacing w:before="60" w:after="60"/>
+            </w:pPr>
+            <w:r/>
+            <w:r>
+              <w:rPr>
+                <w:rFonts w:ascii="Segoe UI" w:hAnsi="Segoe UI"/>
+                <w:b w:val="0"/>
+                <w:i w:val="0"/>
+                <w:color w:val="3A4A4C"/>
+                <w:sz w:val="18"/>
+              </w:rPr>
               <w:t>skip</w:t>
             </w:r>
           </w:p>
@@ -3246,7 +3336,7 @@
         <w:tc>
           <w:tcPr>
             <w:tcW w:type="dxa" w:w="2329"/>
-            <w:shd w:val="clear" w:fill="F5F7F7"/>
+            <w:shd w:val="clear" w:fill="FFFFFF"/>
           </w:tcPr>
           <w:p>
             <w:pPr>
@@ -3291,7 +3381,7 @@
           <w:color w:val="141C1E"/>
           <w:sz w:val="21"/>
         </w:rPr>
-        <w:t>1½ minutes spare</w:t>
+        <w:t>about 1 minute spare</w:t>
       </w:r>
       <w:r>
         <w:rPr>
@@ -3311,7 +3401,7 @@
           <w:color w:val="141C1E"/>
           <w:sz w:val="21"/>
         </w:rPr>
-        <w:t>10:00 mark</w:t>
+        <w:t>10:30 mark</w:t>
       </w:r>
       <w:r>
         <w:rPr>
@@ -3321,7 +3411,7 @@
           <w:color w:val="3A4A4C"/>
           <w:sz w:val="21"/>
         </w:rPr>
-        <w:t xml:space="preserve"> (you should be on page 14), use the cut list at the end.</w:t>
+        <w:t xml:space="preserve"> (you should be on page 15), use the cut list at the end.</w:t>
       </w:r>
     </w:p>
     <w:p>
@@ -3353,7 +3443,7 @@
           <w:color w:val="0D6B67"/>
           <w:sz w:val="40"/>
         </w:rPr>
-        <w:t>Part 1 — The problem (pages Title–3)</w:t>
+        <w:t>Part 1 — The problem (pages Title–4)</w:t>
       </w:r>
     </w:p>
     <w:p>
@@ -3500,7 +3590,7 @@
           <w:color w:val="3A4A4C"/>
           <w:sz w:val="21"/>
         </w:rPr>
-        <w:t xml:space="preserve"> "First, why moving a detector is hard at all."</w:t>
+        <w:t xml:space="preserve"> "First, the basic idea: what anomaly detection is."</w:t>
       </w:r>
     </w:p>
     <w:p>
@@ -3516,7 +3606,7 @@
           <w:color w:val="0D6B67"/>
           <w:sz w:val="30"/>
         </w:rPr>
-        <w:t>Page 1 — A detector is tied to the place it learned · 45 s · clock 1:05</w:t>
+        <w:t>Page 1 — What is video anomaly detection? · 35 s · clock 0:55</w:t>
       </w:r>
     </w:p>
     <w:p>
@@ -3538,7 +3628,72 @@
           <w:color w:val="3A4A4C"/>
           <w:sz w:val="21"/>
         </w:rPr>
-        <w:t xml:space="preserve"> the mall vs factory example — the same forklift, opposite answers.</w:t>
+        <w:t xml:space="preserve"> three pictures — an ordinary moment, the same camera with a cyclist circled, and the detector's score over time; three boxes underneath: What, How, Why it is hard.</w:t>
+      </w:r>
+    </w:p>
+    <w:p>
+      <w:pPr>
+        <w:spacing w:before="200" w:after="80"/>
+        <w:jc w:val="center"/>
+      </w:pPr>
+      <w:r>
+        <w:drawing>
+          <wp:inline xmlns:a="http://schemas.openxmlformats.org/drawingml/2006/main" xmlns:pic="http://schemas.openxmlformats.org/drawingml/2006/picture">
+            <wp:extent cx="5916295" cy="1927278"/>
+            <wp:docPr id="1" name="Picture 1"/>
+            <wp:cNvGraphicFramePr>
+              <a:graphicFrameLocks noChangeAspect="1"/>
+            </wp:cNvGraphicFramePr>
+            <a:graphic>
+              <a:graphicData uri="http://schemas.openxmlformats.org/drawingml/2006/picture">
+                <pic:pic>
+                  <pic:nvPicPr>
+                    <pic:cNvPr id="0" name="fig_intro_anomaly_detection.png"/>
+                    <pic:cNvPicPr/>
+                  </pic:nvPicPr>
+                  <pic:blipFill>
+                    <a:blip r:embed="rId9"/>
+                    <a:stretch>
+                      <a:fillRect/>
+                    </a:stretch>
+                  </pic:blipFill>
+                  <pic:spPr>
+                    <a:xfrm>
+                      <a:off x="0" y="0"/>
+                      <a:ext cx="5916295" cy="1927278"/>
+                    </a:xfrm>
+                    <a:prstGeom prst="rect"/>
+                  </pic:spPr>
+                </pic:pic>
+              </a:graphicData>
+            </a:graphic>
+          </wp:inline>
+        </w:drawing>
+      </w:r>
+    </w:p>
+    <w:p>
+      <w:pPr>
+        <w:spacing w:after="240"/>
+        <w:jc w:val="center"/>
+      </w:pPr>
+      <w:r>
+        <w:rPr>
+          <w:rFonts w:ascii="Segoe UI" w:hAnsi="Segoe UI"/>
+          <w:b/>
+          <w:color w:val="0D6B67"/>
+          <w:sz w:val="18"/>
+        </w:rPr>
+        <w:t xml:space="preserve">Figure 1.  </w:t>
+      </w:r>
+      <w:r>
+        <w:rPr>
+          <w:rFonts w:ascii="Segoe UI" w:hAnsi="Segoe UI"/>
+          <w:b w:val="0"/>
+          <w:i w:val="0"/>
+          <w:color w:val="617274"/>
+          <w:sz w:val="18"/>
+        </w:rPr>
+        <w:t>What video anomaly detection is: an ordinary moment, the same camera with a cyclist, and the detector's score over time.</w:t>
       </w:r>
     </w:p>
     <w:p>
@@ -3567,7 +3722,7 @@
           <w:color w:val="141C1E"/>
           <w:sz w:val="21"/>
         </w:rPr>
-        <w:t xml:space="preserve"> "Today, a detector learns what 'normal' looks like from weeks of footage at one camera. Move it, and it fails — you collect new footage and retrain. Look at this example: a forklift in a shopping mall is an alarm. The same forklift on a factory floor is routine. </w:t>
+        <w:t xml:space="preserve"> "Before the research, the basic idea. </w:t>
       </w:r>
       <w:r>
         <w:rPr>
@@ -3577,7 +3732,7 @@
           <w:color w:val="141C1E"/>
           <w:sz w:val="21"/>
         </w:rPr>
-        <w:t>Same picture, opposite answer. The picture didn't change — the rule did.</w:t>
+        <w:t>Video anomaly detection means finding moments that don't fit what usually happens at that place.</w:t>
       </w:r>
       <w:r>
         <w:rPr>
@@ -3587,10 +3742,8 @@
           <w:color w:val="141C1E"/>
           <w:sz w:val="21"/>
         </w:rPr>
-        <w:t>"</w:t>
-      </w:r>
-    </w:p>
-    <w:p>
+        <w:t xml:space="preserve"> On the left, an ordinary moment on a campus walkway. In the middle — the same camera — a cyclist riding where only people should walk. That's an anomaly. On the right is what a detector produces: </w:t>
+      </w:r>
       <w:r>
         <w:rPr>
           <w:rFonts w:ascii="Georgia" w:hAnsi="Georgia"/>
@@ -3599,115 +3752,17 @@
           <w:color w:val="141C1E"/>
           <w:sz w:val="21"/>
         </w:rPr>
-        <w:t>Point at:</w:t>
-      </w:r>
-      <w:r>
-        <w:rPr>
-          <w:rFonts w:ascii="Georgia" w:hAnsi="Georgia"/>
-          <w:b w:val="0"/>
-          <w:i w:val="0"/>
-          <w:color w:val="3A4A4C"/>
-          <w:sz w:val="21"/>
-        </w:rPr>
-        <w:t xml:space="preserve"> the two boxes, mall then factory.</w:t>
-      </w:r>
-    </w:p>
-    <w:p>
-      <w:r>
-        <w:rPr>
-          <w:rFonts w:ascii="Georgia" w:hAnsi="Georgia"/>
-          <w:b/>
+        <w:t>a score for every frame.</w:t>
+      </w:r>
+      <w:r>
+        <w:rPr>
+          <w:rFonts w:ascii="Georgia" w:hAnsi="Georgia"/>
+          <w:b w:val="0"/>
           <w:i w:val="0"/>
           <w:color w:val="141C1E"/>
           <w:sz w:val="21"/>
         </w:rPr>
-        <w:t>If they ask:</w:t>
-      </w:r>
-    </w:p>
-    <w:p>
-      <w:pPr>
-        <w:pStyle w:val="ListBullet"/>
-        <w:spacing w:after="60"/>
-      </w:pPr>
-      <w:r>
-        <w:rPr>
-          <w:rFonts w:ascii="Georgia" w:hAnsi="Georgia"/>
-          <w:b w:val="0"/>
-          <w:i/>
-          <w:color w:val="3A4A4C"/>
-          <w:sz w:val="21"/>
-        </w:rPr>
-        <w:t>"Is the forklift example from your data?"</w:t>
-      </w:r>
-      <w:r>
-        <w:rPr>
-          <w:rFonts w:ascii="Georgia" w:hAnsi="Georgia"/>
-          <w:b w:val="0"/>
-          <w:i w:val="0"/>
-          <w:color w:val="3A4A4C"/>
-          <w:sz w:val="21"/>
-        </w:rPr>
-        <w:t xml:space="preserve"> — No, it's an illustration. The real example from my data is on page 3: a vehicle on a walkway is an anomaly in ShanghaiTech.</w:t>
-      </w:r>
-    </w:p>
-    <w:p>
-      <w:r>
-        <w:rPr>
-          <w:rFonts w:ascii="Georgia" w:hAnsi="Georgia"/>
-          <w:b/>
-          <w:i w:val="0"/>
-          <w:color w:val="141C1E"/>
-          <w:sz w:val="21"/>
-        </w:rPr>
-        <w:t>→ Next:</w:t>
-      </w:r>
-      <w:r>
-        <w:rPr>
-          <w:rFonts w:ascii="Georgia" w:hAnsi="Georgia"/>
-          <w:b w:val="0"/>
-          <w:i w:val="0"/>
-          <w:color w:val="3A4A4C"/>
-          <w:sz w:val="21"/>
-        </w:rPr>
-        <w:t xml:space="preserve"> "This kind of difference has a name in the literature."</w:t>
-      </w:r>
-    </w:p>
-    <w:p>
-      <w:pPr>
-        <w:keepNext/>
-        <w:spacing w:before="320" w:after="120"/>
-        <w:outlineLvl w:val="1"/>
-      </w:pPr>
-      <w:r>
-        <w:rPr>
-          <w:rFonts w:ascii="Segoe UI" w:hAnsi="Segoe UI"/>
-          <w:b/>
-          <w:color w:val="0D6B67"/>
-          <w:sz w:val="30"/>
-        </w:rPr>
-        <w:t>Page 2 — The literature solves the adjacent problem · 50 s · clock 1:55</w:t>
-      </w:r>
-    </w:p>
-    <w:p>
-      <w:r>
-        <w:rPr>
-          <w:rFonts w:ascii="Georgia" w:hAnsi="Georgia"/>
-          <w:b/>
-          <w:i w:val="0"/>
-          <w:color w:val="141C1E"/>
-          <w:sz w:val="21"/>
-        </w:rPr>
-        <w:t>On screen:</w:t>
-      </w:r>
-      <w:r>
-        <w:rPr>
-          <w:rFonts w:ascii="Georgia" w:hAnsi="Georgia"/>
-          <w:b w:val="0"/>
-          <w:i w:val="0"/>
-          <w:color w:val="3A4A4C"/>
-          <w:sz w:val="21"/>
-        </w:rPr>
-        <w:t xml:space="preserve"> covariate shift vs concept shift table; the Liu quotation.</w:t>
+        <w:t xml:space="preserve"> It stays low, rises during the anomaly — the shaded part — and crosses the alarm line."</w:t>
       </w:r>
     </w:p>
     <w:p>
@@ -3721,12 +3776,22 @@
       <w:r>
         <w:rPr>
           <w:rFonts w:ascii="Georgia" w:hAnsi="Georgia"/>
+          <w:b w:val="0"/>
+          <w:i w:val="0"/>
+          <w:color w:val="141C1E"/>
+          <w:sz w:val="21"/>
+        </w:rPr>
+        <w:t xml:space="preserve">"Why is it hard? </w:t>
+      </w:r>
+      <w:r>
+        <w:rPr>
+          <w:rFonts w:ascii="Georgia" w:hAnsi="Georgia"/>
           <w:b/>
           <w:i w:val="0"/>
           <w:color w:val="141C1E"/>
           <w:sz w:val="21"/>
         </w:rPr>
-        <w:t>Say:</w:t>
+        <w:t>Anomalies are rare and varied, so nobody can collect examples of all of them.</w:t>
       </w:r>
       <w:r>
         <w:rPr>
@@ -3736,47 +3801,7 @@
           <w:color w:val="141C1E"/>
           <w:sz w:val="21"/>
         </w:rPr>
-        <w:t xml:space="preserve"> "Domain adaptation research splits differences between places into kinds. </w:t>
-      </w:r>
-      <w:r>
-        <w:rPr>
-          <w:rFonts w:ascii="Georgia" w:hAnsi="Georgia"/>
-          <w:b/>
-          <w:i w:val="0"/>
-          <w:color w:val="141C1E"/>
-          <w:sz w:val="21"/>
-        </w:rPr>
-        <w:t>Covariate shift: the appearance changes</w:t>
-      </w:r>
-      <w:r>
-        <w:rPr>
-          <w:rFonts w:ascii="Georgia" w:hAnsi="Georgia"/>
-          <w:b w:val="0"/>
-          <w:i w:val="0"/>
-          <w:color w:val="141C1E"/>
-          <w:sz w:val="21"/>
-        </w:rPr>
-        <w:t xml:space="preserve"> — a stop sign in fog. Still a stop sign. </w:t>
-      </w:r>
-      <w:r>
-        <w:rPr>
-          <w:rFonts w:ascii="Georgia" w:hAnsi="Georgia"/>
-          <w:b/>
-          <w:i w:val="0"/>
-          <w:color w:val="141C1E"/>
-          <w:sz w:val="21"/>
-        </w:rPr>
-        <w:t>Concept shift: the rule changes</w:t>
-      </w:r>
-      <w:r>
-        <w:rPr>
-          <w:rFonts w:ascii="Georgia" w:hAnsi="Georgia"/>
-          <w:b w:val="0"/>
-          <w:i w:val="0"/>
-          <w:color w:val="141C1E"/>
-          <w:sz w:val="21"/>
-        </w:rPr>
-        <w:t xml:space="preserve"> — a bicycle on a road versus a footpath. Same image, opposite label. The surveys say openly that they focus on covariate shift. That's fair for recognising objects — a cat is a cat everywhere. But anomaly detection is built on concept shift."</w:t>
+        <w:t xml:space="preserve"> So systems learn what 'normal' looks like instead, and flag anything that doesn't fit."</w:t>
       </w:r>
     </w:p>
     <w:p>
@@ -3798,7 +3823,7 @@
           <w:color w:val="3A4A4C"/>
           <w:sz w:val="21"/>
         </w:rPr>
-        <w:t xml:space="preserve"> the two table rows, then the quotation.</w:t>
+        <w:t xml:space="preserve"> left picture → the red circle → the curve rising inside the shaded part.</w:t>
       </w:r>
     </w:p>
     <w:p>
@@ -3826,7 +3851,7 @@
           <w:color w:val="3A4A4C"/>
           <w:sz w:val="21"/>
         </w:rPr>
-        <w:t>"Which paper is the quote from?"</w:t>
+        <w:t>"Are these real frames?"</w:t>
       </w:r>
       <w:r>
         <w:rPr>
@@ -3836,27 +3861,7 @@
           <w:color w:val="3A4A4C"/>
           <w:sz w:val="21"/>
         </w:rPr>
-        <w:t xml:space="preserve"> — </w:t>
-      </w:r>
-      <w:r>
-        <w:rPr>
-          <w:rFonts w:ascii="Georgia" w:hAnsi="Georgia"/>
-          <w:b/>
-          <w:i w:val="0"/>
-          <w:color w:val="141C1E"/>
-          <w:sz w:val="21"/>
-        </w:rPr>
-        <w:t>Liu et al. 2022, reference [14]</w:t>
-      </w:r>
-      <w:r>
-        <w:rPr>
-          <w:rFonts w:ascii="Georgia" w:hAnsi="Georgia"/>
-          <w:b w:val="0"/>
-          <w:i w:val="0"/>
-          <w:color w:val="3A4A4C"/>
-          <w:sz w:val="21"/>
-        </w:rPr>
-        <w:t>, a survey of unsupervised domain adaptation.</w:t>
+        <w:t xml:space="preserve"> — Yes. ShanghaiTech camera 01, clip 01_0014: frame 17 is the normal one, frame 95 the cyclist.</w:t>
       </w:r>
     </w:p>
     <w:p>
@@ -3872,7 +3877,7 @@
           <w:color w:val="3A4A4C"/>
           <w:sz w:val="21"/>
         </w:rPr>
-        <w:t>"What does Singhal [15] say?"</w:t>
+        <w:t>"Is the score curve from the same clip as the pictures?"</w:t>
       </w:r>
       <w:r>
         <w:rPr>
@@ -3882,7 +3887,7 @@
           <w:color w:val="3A4A4C"/>
           <w:sz w:val="21"/>
         </w:rPr>
-        <w:t xml:space="preserve"> — They list "covariate shift" — that p(y|x) stays the same across domains — as the first condition for domain adaptation to be justified. So the theory assumes concept shift away.</w:t>
+        <w:t xml:space="preserve"> — No, it's clip 04_0004, the clip whose scores I keep saved for figures — the slide says so. Same benchmark, same detector.</w:t>
       </w:r>
     </w:p>
     <w:p>
@@ -3898,7 +3903,7 @@
           <w:color w:val="3A4A4C"/>
           <w:sz w:val="21"/>
         </w:rPr>
-        <w:t>"What are references [11–15, 20]?"</w:t>
+        <w:t>"Which version of the detector made that curve?"</w:t>
       </w:r>
       <w:r>
         <w:rPr>
@@ -3908,10 +3913,62 @@
           <w:color w:val="3A4A4C"/>
           <w:sz w:val="21"/>
         </w:rPr>
-        <w:t xml:space="preserve"> — The six surveys: Patel 2015, Wang 2018, Wilson 2020, Liu 2022, Singhal 2023 — and Kouw &amp; Loog for the taxonomy.</w:t>
+        <w:t xml:space="preserve"> — The correct shared sentence, smoothed over 31 frames, scaled to 0–1 within the clip.</w:t>
       </w:r>
     </w:p>
     <w:p>
+      <w:pPr>
+        <w:pStyle w:val="ListBullet"/>
+        <w:spacing w:after="60"/>
+      </w:pPr>
+      <w:r>
+        <w:rPr>
+          <w:rFonts w:ascii="Georgia" w:hAnsi="Georgia"/>
+          <w:b w:val="0"/>
+          <w:i/>
+          <w:color w:val="3A4A4C"/>
+          <w:sz w:val="21"/>
+        </w:rPr>
+        <w:t>"Why is the alarm line there?"</w:t>
+      </w:r>
+      <w:r>
+        <w:rPr>
+          <w:rFonts w:ascii="Georgia" w:hAnsi="Georgia"/>
+          <w:b w:val="0"/>
+          <w:i w:val="0"/>
+          <w:color w:val="3A4A4C"/>
+          <w:sz w:val="21"/>
+        </w:rPr>
+        <w:t xml:space="preserve"> — It's for illustration. My results use AUROC, which needs no threshold.</w:t>
+      </w:r>
+    </w:p>
+    <w:p>
+      <w:pPr>
+        <w:pStyle w:val="ListBullet"/>
+        <w:spacing w:after="60"/>
+      </w:pPr>
+      <w:r>
+        <w:rPr>
+          <w:rFonts w:ascii="Georgia" w:hAnsi="Georgia"/>
+          <w:b w:val="0"/>
+          <w:i/>
+          <w:color w:val="3A4A4C"/>
+          <w:sz w:val="21"/>
+        </w:rPr>
+        <w:t>"How do you measure success?"</w:t>
+      </w:r>
+      <w:r>
+        <w:rPr>
+          <w:rFonts w:ascii="Georgia" w:hAnsi="Georgia"/>
+          <w:b w:val="0"/>
+          <w:i w:val="0"/>
+          <w:color w:val="3A4A4C"/>
+          <w:sz w:val="21"/>
+        </w:rPr>
+        <w:t xml:space="preserve"> — AUROC: pick one anomalous frame and one normal frame at random; how often does the anomalous one score higher? 0.5 is guessing, 1.0 is perfect.</w:t>
+      </w:r>
+    </w:p>
+    <w:p>
       <w:r>
         <w:rPr>
           <w:rFonts w:ascii="Georgia" w:hAnsi="Georgia"/>
@@ -3930,7 +3987,7 @@
           <w:color w:val="3A4A4C"/>
           <w:sz w:val="21"/>
         </w:rPr>
-        <w:t xml:space="preserve"> "Why that matters for anomaly detection specifically."</w:t>
+        <w:t xml:space="preserve"> "Today, building one of these ties it to a single place. That's the problem."</w:t>
       </w:r>
     </w:p>
     <w:p>
@@ -3946,7 +4003,437 @@
           <w:color w:val="0D6B67"/>
           <w:sz w:val="30"/>
         </w:rPr>
-        <w:t>Page 3 — Why that matters for anomaly detection · 40 s · clock 2:35</w:t>
+        <w:t>Page 2 — A detector is tied to the place it learned · 45 s · clock 1:40</w:t>
+      </w:r>
+    </w:p>
+    <w:p>
+      <w:r>
+        <w:rPr>
+          <w:rFonts w:ascii="Georgia" w:hAnsi="Georgia"/>
+          <w:b/>
+          <w:i w:val="0"/>
+          <w:color w:val="141C1E"/>
+          <w:sz w:val="21"/>
+        </w:rPr>
+        <w:t>On screen:</w:t>
+      </w:r>
+      <w:r>
+        <w:rPr>
+          <w:rFonts w:ascii="Georgia" w:hAnsi="Georgia"/>
+          <w:b w:val="0"/>
+          <w:i w:val="0"/>
+          <w:color w:val="3A4A4C"/>
+          <w:sz w:val="21"/>
+        </w:rPr>
+        <w:t xml:space="preserve"> the mall vs factory example — the same forklift, opposite answers.</w:t>
+      </w:r>
+    </w:p>
+    <w:p>
+      <w:pPr>
+        <w:spacing w:before="120" w:after="120"/>
+        <w:ind w:left="317"/>
+        <w:pBdr>
+          <w:left w:val="single" w:sz="18" w:space="10" w:color="0D6B67"/>
+        </w:pBdr>
+      </w:pPr>
+      <w:r>
+        <w:rPr>
+          <w:rFonts w:ascii="Georgia" w:hAnsi="Georgia"/>
+          <w:b/>
+          <w:i w:val="0"/>
+          <w:color w:val="141C1E"/>
+          <w:sz w:val="21"/>
+        </w:rPr>
+        <w:t>Say:</w:t>
+      </w:r>
+      <w:r>
+        <w:rPr>
+          <w:rFonts w:ascii="Georgia" w:hAnsi="Georgia"/>
+          <w:b w:val="0"/>
+          <w:i w:val="0"/>
+          <w:color w:val="141C1E"/>
+          <w:sz w:val="21"/>
+        </w:rPr>
+        <w:t xml:space="preserve"> "Today, a detector learns what 'normal' looks like from weeks of footage at one camera. Move it, and it fails — you collect new footage and retrain. Look at this example: a forklift in a shopping mall is an alarm. The same forklift on a factory floor is routine. </w:t>
+      </w:r>
+      <w:r>
+        <w:rPr>
+          <w:rFonts w:ascii="Georgia" w:hAnsi="Georgia"/>
+          <w:b/>
+          <w:i w:val="0"/>
+          <w:color w:val="141C1E"/>
+          <w:sz w:val="21"/>
+        </w:rPr>
+        <w:t>Same picture, opposite answer. The picture didn't change — the rule did.</w:t>
+      </w:r>
+      <w:r>
+        <w:rPr>
+          <w:rFonts w:ascii="Georgia" w:hAnsi="Georgia"/>
+          <w:b w:val="0"/>
+          <w:i w:val="0"/>
+          <w:color w:val="141C1E"/>
+          <w:sz w:val="21"/>
+        </w:rPr>
+        <w:t>"</w:t>
+      </w:r>
+    </w:p>
+    <w:p>
+      <w:r>
+        <w:rPr>
+          <w:rFonts w:ascii="Georgia" w:hAnsi="Georgia"/>
+          <w:b/>
+          <w:i w:val="0"/>
+          <w:color w:val="141C1E"/>
+          <w:sz w:val="21"/>
+        </w:rPr>
+        <w:t>Point at:</w:t>
+      </w:r>
+      <w:r>
+        <w:rPr>
+          <w:rFonts w:ascii="Georgia" w:hAnsi="Georgia"/>
+          <w:b w:val="0"/>
+          <w:i w:val="0"/>
+          <w:color w:val="3A4A4C"/>
+          <w:sz w:val="21"/>
+        </w:rPr>
+        <w:t xml:space="preserve"> the two boxes, mall then factory.</w:t>
+      </w:r>
+    </w:p>
+    <w:p>
+      <w:r>
+        <w:rPr>
+          <w:rFonts w:ascii="Georgia" w:hAnsi="Georgia"/>
+          <w:b/>
+          <w:i w:val="0"/>
+          <w:color w:val="141C1E"/>
+          <w:sz w:val="21"/>
+        </w:rPr>
+        <w:t>If they ask:</w:t>
+      </w:r>
+    </w:p>
+    <w:p>
+      <w:pPr>
+        <w:pStyle w:val="ListBullet"/>
+        <w:spacing w:after="60"/>
+      </w:pPr>
+      <w:r>
+        <w:rPr>
+          <w:rFonts w:ascii="Georgia" w:hAnsi="Georgia"/>
+          <w:b w:val="0"/>
+          <w:i/>
+          <w:color w:val="3A4A4C"/>
+          <w:sz w:val="21"/>
+        </w:rPr>
+        <w:t>"Is the forklift example from your data?"</w:t>
+      </w:r>
+      <w:r>
+        <w:rPr>
+          <w:rFonts w:ascii="Georgia" w:hAnsi="Georgia"/>
+          <w:b w:val="0"/>
+          <w:i w:val="0"/>
+          <w:color w:val="3A4A4C"/>
+          <w:sz w:val="21"/>
+        </w:rPr>
+        <w:t xml:space="preserve"> — No, it's an illustration. The real example from my data is on page 4: a vehicle on a walkway is an anomaly in ShanghaiTech.</w:t>
+      </w:r>
+    </w:p>
+    <w:p>
+      <w:r>
+        <w:rPr>
+          <w:rFonts w:ascii="Georgia" w:hAnsi="Georgia"/>
+          <w:b/>
+          <w:i w:val="0"/>
+          <w:color w:val="141C1E"/>
+          <w:sz w:val="21"/>
+        </w:rPr>
+        <w:t>→ Next:</w:t>
+      </w:r>
+      <w:r>
+        <w:rPr>
+          <w:rFonts w:ascii="Georgia" w:hAnsi="Georgia"/>
+          <w:b w:val="0"/>
+          <w:i w:val="0"/>
+          <w:color w:val="3A4A4C"/>
+          <w:sz w:val="21"/>
+        </w:rPr>
+        <w:t xml:space="preserve"> "This kind of difference has a name in the literature."</w:t>
+      </w:r>
+    </w:p>
+    <w:p>
+      <w:pPr>
+        <w:keepNext/>
+        <w:spacing w:before="320" w:after="120"/>
+        <w:outlineLvl w:val="1"/>
+      </w:pPr>
+      <w:r>
+        <w:rPr>
+          <w:rFonts w:ascii="Segoe UI" w:hAnsi="Segoe UI"/>
+          <w:b/>
+          <w:color w:val="0D6B67"/>
+          <w:sz w:val="30"/>
+        </w:rPr>
+        <w:t>Page 3 — The literature solves the adjacent problem · 50 s · clock 2:30</w:t>
+      </w:r>
+    </w:p>
+    <w:p>
+      <w:r>
+        <w:rPr>
+          <w:rFonts w:ascii="Georgia" w:hAnsi="Georgia"/>
+          <w:b/>
+          <w:i w:val="0"/>
+          <w:color w:val="141C1E"/>
+          <w:sz w:val="21"/>
+        </w:rPr>
+        <w:t>On screen:</w:t>
+      </w:r>
+      <w:r>
+        <w:rPr>
+          <w:rFonts w:ascii="Georgia" w:hAnsi="Georgia"/>
+          <w:b w:val="0"/>
+          <w:i w:val="0"/>
+          <w:color w:val="3A4A4C"/>
+          <w:sz w:val="21"/>
+        </w:rPr>
+        <w:t xml:space="preserve"> covariate shift vs concept shift table; the Liu quotation.</w:t>
+      </w:r>
+    </w:p>
+    <w:p>
+      <w:pPr>
+        <w:spacing w:before="120" w:after="120"/>
+        <w:ind w:left="317"/>
+        <w:pBdr>
+          <w:left w:val="single" w:sz="18" w:space="10" w:color="0D6B67"/>
+        </w:pBdr>
+      </w:pPr>
+      <w:r>
+        <w:rPr>
+          <w:rFonts w:ascii="Georgia" w:hAnsi="Georgia"/>
+          <w:b/>
+          <w:i w:val="0"/>
+          <w:color w:val="141C1E"/>
+          <w:sz w:val="21"/>
+        </w:rPr>
+        <w:t>Say:</w:t>
+      </w:r>
+      <w:r>
+        <w:rPr>
+          <w:rFonts w:ascii="Georgia" w:hAnsi="Georgia"/>
+          <w:b w:val="0"/>
+          <w:i w:val="0"/>
+          <w:color w:val="141C1E"/>
+          <w:sz w:val="21"/>
+        </w:rPr>
+        <w:t xml:space="preserve"> "Domain adaptation research splits differences between places into kinds. </w:t>
+      </w:r>
+      <w:r>
+        <w:rPr>
+          <w:rFonts w:ascii="Georgia" w:hAnsi="Georgia"/>
+          <w:b/>
+          <w:i w:val="0"/>
+          <w:color w:val="141C1E"/>
+          <w:sz w:val="21"/>
+        </w:rPr>
+        <w:t>Covariate shift: the appearance changes</w:t>
+      </w:r>
+      <w:r>
+        <w:rPr>
+          <w:rFonts w:ascii="Georgia" w:hAnsi="Georgia"/>
+          <w:b w:val="0"/>
+          <w:i w:val="0"/>
+          <w:color w:val="141C1E"/>
+          <w:sz w:val="21"/>
+        </w:rPr>
+        <w:t xml:space="preserve"> — a stop sign in fog. Still a stop sign. </w:t>
+      </w:r>
+      <w:r>
+        <w:rPr>
+          <w:rFonts w:ascii="Georgia" w:hAnsi="Georgia"/>
+          <w:b/>
+          <w:i w:val="0"/>
+          <w:color w:val="141C1E"/>
+          <w:sz w:val="21"/>
+        </w:rPr>
+        <w:t>Concept shift: the rule changes</w:t>
+      </w:r>
+      <w:r>
+        <w:rPr>
+          <w:rFonts w:ascii="Georgia" w:hAnsi="Georgia"/>
+          <w:b w:val="0"/>
+          <w:i w:val="0"/>
+          <w:color w:val="141C1E"/>
+          <w:sz w:val="21"/>
+        </w:rPr>
+        <w:t xml:space="preserve"> — a bicycle on a road versus a footpath. Same image, opposite label. The surveys say openly that they focus on covariate shift. That's fair for recognising objects — a cat is a cat everywhere. But anomaly detection is built on concept shift."</w:t>
+      </w:r>
+    </w:p>
+    <w:p>
+      <w:r>
+        <w:rPr>
+          <w:rFonts w:ascii="Georgia" w:hAnsi="Georgia"/>
+          <w:b/>
+          <w:i w:val="0"/>
+          <w:color w:val="141C1E"/>
+          <w:sz w:val="21"/>
+        </w:rPr>
+        <w:t>Point at:</w:t>
+      </w:r>
+      <w:r>
+        <w:rPr>
+          <w:rFonts w:ascii="Georgia" w:hAnsi="Georgia"/>
+          <w:b w:val="0"/>
+          <w:i w:val="0"/>
+          <w:color w:val="3A4A4C"/>
+          <w:sz w:val="21"/>
+        </w:rPr>
+        <w:t xml:space="preserve"> the two table rows, then the quotation.</w:t>
+      </w:r>
+    </w:p>
+    <w:p>
+      <w:r>
+        <w:rPr>
+          <w:rFonts w:ascii="Georgia" w:hAnsi="Georgia"/>
+          <w:b/>
+          <w:i w:val="0"/>
+          <w:color w:val="141C1E"/>
+          <w:sz w:val="21"/>
+        </w:rPr>
+        <w:t>If they ask:</w:t>
+      </w:r>
+    </w:p>
+    <w:p>
+      <w:pPr>
+        <w:pStyle w:val="ListBullet"/>
+        <w:spacing w:after="60"/>
+      </w:pPr>
+      <w:r>
+        <w:rPr>
+          <w:rFonts w:ascii="Georgia" w:hAnsi="Georgia"/>
+          <w:b w:val="0"/>
+          <w:i/>
+          <w:color w:val="3A4A4C"/>
+          <w:sz w:val="21"/>
+        </w:rPr>
+        <w:t>"Which paper is the quote from?"</w:t>
+      </w:r>
+      <w:r>
+        <w:rPr>
+          <w:rFonts w:ascii="Georgia" w:hAnsi="Georgia"/>
+          <w:b w:val="0"/>
+          <w:i w:val="0"/>
+          <w:color w:val="3A4A4C"/>
+          <w:sz w:val="21"/>
+        </w:rPr>
+        <w:t xml:space="preserve"> — </w:t>
+      </w:r>
+      <w:r>
+        <w:rPr>
+          <w:rFonts w:ascii="Georgia" w:hAnsi="Georgia"/>
+          <w:b/>
+          <w:i w:val="0"/>
+          <w:color w:val="141C1E"/>
+          <w:sz w:val="21"/>
+        </w:rPr>
+        <w:t>Liu et al. 2022, reference [14]</w:t>
+      </w:r>
+      <w:r>
+        <w:rPr>
+          <w:rFonts w:ascii="Georgia" w:hAnsi="Georgia"/>
+          <w:b w:val="0"/>
+          <w:i w:val="0"/>
+          <w:color w:val="3A4A4C"/>
+          <w:sz w:val="21"/>
+        </w:rPr>
+        <w:t>, a survey of unsupervised domain adaptation.</w:t>
+      </w:r>
+    </w:p>
+    <w:p>
+      <w:pPr>
+        <w:pStyle w:val="ListBullet"/>
+        <w:spacing w:after="60"/>
+      </w:pPr>
+      <w:r>
+        <w:rPr>
+          <w:rFonts w:ascii="Georgia" w:hAnsi="Georgia"/>
+          <w:b w:val="0"/>
+          <w:i/>
+          <w:color w:val="3A4A4C"/>
+          <w:sz w:val="21"/>
+        </w:rPr>
+        <w:t>"What does Singhal [15] say?"</w:t>
+      </w:r>
+      <w:r>
+        <w:rPr>
+          <w:rFonts w:ascii="Georgia" w:hAnsi="Georgia"/>
+          <w:b w:val="0"/>
+          <w:i w:val="0"/>
+          <w:color w:val="3A4A4C"/>
+          <w:sz w:val="21"/>
+        </w:rPr>
+        <w:t xml:space="preserve"> — They list "covariate shift" — that p(y|x) stays the same across domains — as the first condition for domain adaptation to be justified. So the theory assumes concept shift away.</w:t>
+      </w:r>
+    </w:p>
+    <w:p>
+      <w:pPr>
+        <w:pStyle w:val="ListBullet"/>
+        <w:spacing w:after="60"/>
+      </w:pPr>
+      <w:r>
+        <w:rPr>
+          <w:rFonts w:ascii="Georgia" w:hAnsi="Georgia"/>
+          <w:b w:val="0"/>
+          <w:i/>
+          <w:color w:val="3A4A4C"/>
+          <w:sz w:val="21"/>
+        </w:rPr>
+        <w:t>"What are references [11–15, 20]?"</w:t>
+      </w:r>
+      <w:r>
+        <w:rPr>
+          <w:rFonts w:ascii="Georgia" w:hAnsi="Georgia"/>
+          <w:b w:val="0"/>
+          <w:i w:val="0"/>
+          <w:color w:val="3A4A4C"/>
+          <w:sz w:val="21"/>
+        </w:rPr>
+        <w:t xml:space="preserve"> — The six surveys: Patel 2015, Wang 2018, Wilson 2020, Liu 2022, Singhal 2023 — and Kouw &amp; Loog for the taxonomy.</w:t>
+      </w:r>
+    </w:p>
+    <w:p>
+      <w:r>
+        <w:rPr>
+          <w:rFonts w:ascii="Georgia" w:hAnsi="Georgia"/>
+          <w:b/>
+          <w:i w:val="0"/>
+          <w:color w:val="141C1E"/>
+          <w:sz w:val="21"/>
+        </w:rPr>
+        <w:t>→ Next:</w:t>
+      </w:r>
+      <w:r>
+        <w:rPr>
+          <w:rFonts w:ascii="Georgia" w:hAnsi="Georgia"/>
+          <w:b w:val="0"/>
+          <w:i w:val="0"/>
+          <w:color w:val="3A4A4C"/>
+          <w:sz w:val="21"/>
+        </w:rPr>
+        <w:t xml:space="preserve"> "Why that matters for anomaly detection specifically."</w:t>
+      </w:r>
+    </w:p>
+    <w:p>
+      <w:pPr>
+        <w:keepNext/>
+        <w:spacing w:before="320" w:after="120"/>
+        <w:outlineLvl w:val="1"/>
+      </w:pPr>
+      <w:r>
+        <w:rPr>
+          <w:rFonts w:ascii="Segoe UI" w:hAnsi="Segoe UI"/>
+          <w:b/>
+          <w:color w:val="0D6B67"/>
+          <w:sz w:val="30"/>
+        </w:rPr>
+        <w:t>Page 4 — Why that matters for anomaly detection · 40 s · clock 3:10</w:t>
       </w:r>
     </w:p>
     <w:p>
@@ -4175,7 +4662,7 @@
           <w:color w:val="0D6B67"/>
           <w:sz w:val="40"/>
         </w:rPr>
-        <w:t>Part 2 — The method (pages 4–8)</w:t>
+        <w:t>Part 2 — The method (pages 5–9)</w:t>
       </w:r>
     </w:p>
     <w:p>
@@ -4191,7 +4678,7 @@
           <w:color w:val="0D6B67"/>
           <w:sz w:val="30"/>
         </w:rPr>
-        <w:t>Page 4 — The framework diagram · 2 min · clock 4:35</w:t>
+        <w:t>Page 5 — DA-ZVAD: one sentence per camera (the diagram) · 2 min · clock 5:10</w:t>
       </w:r>
     </w:p>
     <w:p>
@@ -4225,7 +4712,7 @@
         <w:drawing>
           <wp:inline xmlns:a="http://schemas.openxmlformats.org/drawingml/2006/main" xmlns:pic="http://schemas.openxmlformats.org/drawingml/2006/picture">
             <wp:extent cx="5916295" cy="3486388"/>
-            <wp:docPr id="1" name="Picture 1"/>
+            <wp:docPr id="2" name="Picture 2"/>
             <wp:cNvGraphicFramePr>
               <a:graphicFrameLocks noChangeAspect="1"/>
             </wp:cNvGraphicFramePr>
@@ -4237,7 +4724,7 @@
                     <pic:cNvPicPr/>
                   </pic:nvPicPr>
                   <pic:blipFill>
-                    <a:blip r:embed="rId9"/>
+                    <a:blip r:embed="rId10"/>
                     <a:stretch>
                       <a:fillRect/>
                     </a:stretch>
@@ -4268,7 +4755,7 @@
           <w:color w:val="0D6B67"/>
           <w:sz w:val="18"/>
         </w:rPr>
-        <w:t xml:space="preserve">Figure 1.  </w:t>
+        <w:t xml:space="preserve">Figure 2.  </w:t>
       </w:r>
       <w:r>
         <w:rPr>
@@ -4446,7 +4933,7 @@
           <w:color w:val="141C1E"/>
           <w:sz w:val="21"/>
         </w:rPr>
-        <w:t xml:space="preserve"> That one rule is the most important arrow in the diagram — page 12 shows what happens without it."</w:t>
+        <w:t xml:space="preserve"> That one rule is the most important arrow in the diagram — page 13 shows what happens without it."</w:t>
       </w:r>
     </w:p>
     <w:p>
@@ -4665,7 +5152,7 @@
           <w:color w:val="3A4A4C"/>
           <w:sz w:val="21"/>
         </w:rPr>
-        <w:t xml:space="preserve"> — From a sweep: performance rises up to 31 and falls after, so it's a real optimum (page 18).</w:t>
+        <w:t xml:space="preserve"> — From a sweep: performance rises up to 31 and falls after, so it's a real optimum (page 19).</w:t>
       </w:r>
     </w:p>
     <w:p>
@@ -4833,7 +5320,7 @@
           <w:color w:val="0D6B67"/>
           <w:sz w:val="30"/>
         </w:rPr>
-        <w:t>Page 5 — Why freezing everything is the point · 40 s · clock 5:15</w:t>
+        <w:t>Page 6 — Why freezing everything is the point · 40 s · clock 5:50</w:t>
       </w:r>
     </w:p>
     <w:p>
@@ -5018,7 +5505,7 @@
           <w:color w:val="0D6B67"/>
           <w:sz w:val="30"/>
         </w:rPr>
-        <w:t>Page 6 — A protocol that can prove us wrong · 40 s · clock 5:55</w:t>
+        <w:t>Page 7 — A protocol that can prove us wrong · 40 s · clock 6:30</w:t>
       </w:r>
     </w:p>
     <w:p>
@@ -5225,7 +5712,7 @@
           <w:color w:val="0D6B67"/>
           <w:sz w:val="30"/>
         </w:rPr>
-        <w:t>Page 7 — What we ran · 25 s · clock 6:20</w:t>
+        <w:t>Page 8 — What we ran · 25 s · clock 6:55</w:t>
       </w:r>
     </w:p>
     <w:p>
@@ -5470,7 +5957,7 @@
           <w:color w:val="0D6B67"/>
           <w:sz w:val="30"/>
         </w:rPr>
-        <w:t>Page 8 — What the two campus benchmarks look like · 20 s · clock 6:40</w:t>
+        <w:t>Page 9 — What the two campus benchmarks look like · 20 s · clock 7:15</w:t>
       </w:r>
     </w:p>
     <w:p>
@@ -5579,7 +6066,7 @@
           <w:color w:val="3A4A4C"/>
           <w:sz w:val="21"/>
         </w:rPr>
-        <w:t xml:space="preserve"> — This figure is about one fixed camera, which UCF-Crime doesn't have; its results are on pages 23–24.</w:t>
+        <w:t xml:space="preserve"> — This figure is about one fixed camera, which UCF-Crime doesn't have; its results are on pages 24–25.</w:t>
       </w:r>
     </w:p>
     <w:p>
@@ -5633,7 +6120,7 @@
           <w:color w:val="0D6B67"/>
           <w:sz w:val="40"/>
         </w:rPr>
-        <w:t>Part 3 — Failure and diagnosis (pages 9–12)</w:t>
+        <w:t>Part 3 — Failure and diagnosis (pages 10–13)</w:t>
       </w:r>
     </w:p>
     <w:p>
@@ -5649,7 +6136,7 @@
           <w:color w:val="0D6B67"/>
           <w:sz w:val="30"/>
         </w:rPr>
-        <w:t>Page 9 — The first result was a failure · 30 s · clock 7:10</w:t>
+        <w:t>Page 10 — The first result was a failure · 30 s · clock 7:45</w:t>
       </w:r>
     </w:p>
     <w:p>
@@ -5866,7 +6353,7 @@
           <w:color w:val="0D6B67"/>
           <w:sz w:val="30"/>
         </w:rPr>
-        <w:t>Page 10 — Diagnosis 1: we were measuring it wrong · 45 s · clock 7:55</w:t>
+        <w:t>Page 11 — Diagnosis 1: we were measuring it wrong · 45 s · clock 8:30</w:t>
       </w:r>
     </w:p>
     <w:p>
@@ -6105,7 +6592,7 @@
           <w:color w:val="0D6B67"/>
           <w:sz w:val="30"/>
         </w:rPr>
-        <w:t>Page 11 — The evidence for that diagnosis · 20 s · clock 8:15</w:t>
+        <w:t>Page 12 — The evidence for that diagnosis · 20 s · clock 8:50</w:t>
       </w:r>
     </w:p>
     <w:p>
@@ -6272,7 +6759,7 @@
           <w:color w:val="0D6B67"/>
           <w:sz w:val="30"/>
         </w:rPr>
-        <w:t>Page 12 — Diagnosis 2: the description cancelled itself out · 50 s · clock 9:05</w:t>
+        <w:t>Page 13 — Diagnosis 2: the description cancelled itself out · 50 s · clock 9:40</w:t>
       </w:r>
     </w:p>
     <w:p>
@@ -6503,7 +6990,7 @@
           <w:color w:val="0D6B67"/>
           <w:sz w:val="40"/>
         </w:rPr>
-        <w:t>Part 4 — The central result (pages 13–18)</w:t>
+        <w:t>Part 4 — The central result (pages 14–19)</w:t>
       </w:r>
     </w:p>
     <w:p>
@@ -6519,7 +7006,7 @@
           <w:color w:val="0D6B67"/>
           <w:sz w:val="30"/>
         </w:rPr>
-        <w:t>Page 13 — After the fix: the predicted signature · 45 s · clock 9:50</w:t>
+        <w:t>Page 14 — After the fix: the predicted signature · 45 s · clock 10:25</w:t>
       </w:r>
     </w:p>
     <w:p>
@@ -6630,7 +7117,7 @@
           <w:color w:val="141C1E"/>
           <w:sz w:val="21"/>
         </w:rPr>
-        <w:t xml:space="preserve"> it caused it is page 16."</w:t>
+        <w:t xml:space="preserve"> it caused it is page 17."</w:t>
       </w:r>
     </w:p>
     <w:p>
@@ -6732,7 +7219,7 @@
           <w:color w:val="0D6B67"/>
           <w:sz w:val="30"/>
         </w:rPr>
-        <w:t>Page 14 — The same experiment, drawn · 15 s · clock 10:05</w:t>
+        <w:t>Page 15 — The same experiment, drawn · 15 s · clock 10:40</w:t>
       </w:r>
     </w:p>
     <w:p>
@@ -6819,7 +7306,7 @@
           <w:color w:val="0D6B67"/>
           <w:sz w:val="30"/>
         </w:rPr>
-        <w:t>Page 15 — One clip, two sentences · 20 s · clock 10:25</w:t>
+        <w:t>Page 16 — One clip, two sentences · 20 s · clock 11:00</w:t>
       </w:r>
     </w:p>
     <w:p>
@@ -6906,7 +7393,7 @@
           <w:color w:val="3A4A4C"/>
           <w:sz w:val="21"/>
         </w:rPr>
-        <w:t xml:space="preserve"> — ShanghaiTech clip 04_0004. It's one example; the averages are on pages 13–14.</w:t>
+        <w:t xml:space="preserve"> — ShanghaiTech clip 04_0004. It's one example; the averages are on pages 14–15.</w:t>
       </w:r>
     </w:p>
     <w:p>
@@ -6944,7 +7431,7 @@
           <w:color w:val="0D6B67"/>
           <w:sz w:val="30"/>
         </w:rPr>
-        <w:t>Page 16 — Stating the claim precisely · 50 s · clock 11:15</w:t>
+        <w:t>Page 17 — Stating the claim precisely · 50 s · clock 11:50</w:t>
       </w:r>
     </w:p>
     <w:p>
@@ -7224,7 +7711,7 @@
           <w:color w:val="3A4A4C"/>
           <w:sz w:val="21"/>
         </w:rPr>
-        <w:t xml:space="preserve"> — The spread of results when I split the clips into different halves five times (page 17).</w:t>
+        <w:t xml:space="preserve"> — The spread of results when I split the clips into different halves five times (page 18).</w:t>
       </w:r>
     </w:p>
     <w:p>
@@ -7262,7 +7749,7 @@
           <w:color w:val="0D6B67"/>
           <w:sz w:val="30"/>
         </w:rPr>
-        <w:t>Page 17 — Which components earn their place · 30 s · clock 11:45</w:t>
+        <w:t>Page 18 — Which components earn their place · 30 s · clock 12:20</w:t>
       </w:r>
     </w:p>
     <w:p>
@@ -7413,7 +7900,7 @@
           <w:color w:val="0D6B67"/>
           <w:sz w:val="30"/>
         </w:rPr>
-        <w:t>Page 18 — Window length, and what each component adds · 15 s · clock 12:00</w:t>
+        <w:t>Page 19 — Window length, and what each component adds · 15 s · clock 12:35</w:t>
       </w:r>
     </w:p>
     <w:p>
@@ -7536,7 +8023,7 @@
           <w:color w:val="0D6B67"/>
           <w:sz w:val="40"/>
         </w:rPr>
-        <w:t>Part 5 — Other datasets and Phase 3 (pages 19–25)</w:t>
+        <w:t>Part 5 — Other datasets and Phase 3 (pages 20–26)</w:t>
       </w:r>
     </w:p>
     <w:p>
@@ -7552,7 +8039,7 @@
           <w:color w:val="0D6B67"/>
           <w:sz w:val="30"/>
         </w:rPr>
-        <w:t>Page 19 — A second domain: the replication test · 45 s · clock 12:45</w:t>
+        <w:t>Page 20 — A second domain: the replication test · 45 s · clock 13:20</w:t>
       </w:r>
     </w:p>
     <w:p>
@@ -7765,7 +8252,7 @@
           <w:color w:val="0D6B67"/>
           <w:sz w:val="30"/>
         </w:rPr>
-        <w:t>Page 20 — We tested that explanation, and it held · 40 s · clock 13:25</w:t>
+        <w:t>Page 21 — We tested that explanation, and it held · 40 s · clock 14:00</w:t>
       </w:r>
     </w:p>
     <w:p>
@@ -8024,7 +8511,7 @@
           <w:color w:val="0D6B67"/>
           <w:sz w:val="30"/>
         </w:rPr>
-        <w:t>Page 21 — Every camera view, one at a time · 15 s · clock 13:40</w:t>
+        <w:t>Page 22 — Every camera view, one at a time · 15 s · clock 14:15</w:t>
       </w:r>
     </w:p>
     <w:p>
@@ -8149,7 +8636,7 @@
           <w:color w:val="0D6B67"/>
           <w:sz w:val="30"/>
         </w:rPr>
-        <w:t>Page 22 — A sentence per camera, written by the system · 45 s · clock 14:25</w:t>
+        <w:t>Page 23 — A sentence per camera, written by the system · 45 s · clock 15:00</w:t>
       </w:r>
     </w:p>
     <w:p>
@@ -8434,7 +8921,7 @@
           <w:color w:val="0D6B67"/>
           <w:sz w:val="30"/>
         </w:rPr>
-        <w:t>Page 23 — UCF-Crime: predictions written down first · 60 s · clock 15:25</w:t>
+        <w:t>Page 24 — UCF-Crime: predictions written down first · 60 s · clock 16:00</w:t>
       </w:r>
     </w:p>
     <w:p>
@@ -8751,7 +9238,7 @@
           <w:color w:val="0D6B67"/>
           <w:sz w:val="30"/>
         </w:rPr>
-        <w:t>Page 24 — UCF-Crime, drawn · 20 s · clock 15:45</w:t>
+        <w:t>Page 25 — UCF-Crime, drawn · 20 s · clock 16:20</w:t>
       </w:r>
     </w:p>
     <w:p>
@@ -8876,7 +9363,7 @@
           <w:color w:val="0D6B67"/>
           <w:sz w:val="30"/>
         </w:rPr>
-        <w:t>Page 25 — Six things that did not work · 25 s · clock 16:10</w:t>
+        <w:t>Page 26 — Six things that did not work · 25 s · clock 16:45</w:t>
       </w:r>
     </w:p>
     <w:p>
@@ -8945,7 +9432,7 @@
           <w:color w:val="141C1E"/>
           <w:sz w:val="21"/>
         </w:rPr>
-        <w:t xml:space="preserve"> — 0.486 — because the shared words caused the same cancelling problem as page 12."</w:t>
+        <w:t xml:space="preserve"> — 0.486 — because the shared words caused the same cancelling problem as page 13."</w:t>
       </w:r>
     </w:p>
     <w:p>
@@ -9037,7 +9524,7 @@
           <w:color w:val="0D6B67"/>
           <w:sz w:val="40"/>
         </w:rPr>
-        <w:t>Part 6 — Assessment and close (pages 26–29)</w:t>
+        <w:t>Part 6 — Assessment and close (pages 27–30)</w:t>
       </w:r>
     </w:p>
     <w:p>
@@ -9053,7 +9540,7 @@
           <w:color w:val="0D6B67"/>
           <w:sz w:val="30"/>
         </w:rPr>
-        <w:t>Page 26 — Where this sits against the literature · 50 s · clock 17:00</w:t>
+        <w:t>Page 27 — Where this sits against the literature · 50 s · clock 17:35</w:t>
       </w:r>
     </w:p>
     <w:p>
@@ -9220,7 +9707,7 @@
           <w:color w:val="3A4A4C"/>
           <w:sz w:val="21"/>
         </w:rPr>
-        <w:t>"Why is your Avenue number 67.7 here but 0.706 on page 19?"</w:t>
+        <w:t>"Why is your Avenue number 67.7 here but 0.706 on page 20?"</w:t>
       </w:r>
       <w:r>
         <w:rPr>
@@ -9346,7 +9833,7 @@
           <w:color w:val="0D6B67"/>
           <w:sz w:val="30"/>
         </w:rPr>
-        <w:t>Page 27 — Limitations we are stating ourselves · 35 s · clock 17:35</w:t>
+        <w:t>Page 28 — Limitations we are stating ourselves · 35 s · clock 18:10</w:t>
       </w:r>
     </w:p>
     <w:p>
@@ -9491,7 +9978,7 @@
           <w:color w:val="0D6B67"/>
           <w:sz w:val="30"/>
         </w:rPr>
-        <w:t>Page 28 — What comes next · 25 s · clock 18:00</w:t>
+        <w:t>Page 29 — What comes next · 25 s · clock 18:35</w:t>
       </w:r>
     </w:p>
     <w:p>
@@ -9636,7 +10123,7 @@
           <w:color w:val="0D6B67"/>
           <w:sz w:val="30"/>
         </w:rPr>
-        <w:t>Page 29 — Summary · 30 s · clock 18:30</w:t>
+        <w:t>Page 30 — Summary · 30 s · clock 19:05</w:t>
       </w:r>
     </w:p>
     <w:p>
@@ -9805,7 +10292,7 @@
           <w:color w:val="0D6B67"/>
           <w:sz w:val="30"/>
         </w:rPr>
-        <w:t>Pages 30–32 — References</w:t>
+        <w:t>Pages 31–33 — References</w:t>
       </w:r>
     </w:p>
     <w:p>
@@ -11387,7 +11874,7 @@
           <w:color w:val="3A4A4C"/>
           <w:sz w:val="21"/>
         </w:rPr>
-        <w:t>Page 14 (drawn version of 13) — say "same numbers, as bars".</w:t>
+        <w:t>Page 15 (drawn version of 14) — say "same numbers, as bars".</w:t>
       </w:r>
     </w:p>
     <w:p>
@@ -11403,7 +11890,7 @@
           <w:color w:val="3A4A4C"/>
           <w:sz w:val="21"/>
         </w:rPr>
-        <w:t>Page 18 (window chart).</w:t>
+        <w:t>Page 19 (window chart).</w:t>
       </w:r>
     </w:p>
     <w:p>
@@ -11419,7 +11906,7 @@
           <w:color w:val="3A4A4C"/>
           <w:sz w:val="21"/>
         </w:rPr>
-        <w:t>Page 21 (per-view bars) — say "three of nine are negative" on page 20.</w:t>
+        <w:t>Page 22 (per-view bars) — say "three of nine are negative" on page 21.</w:t>
       </w:r>
     </w:p>
     <w:p>
@@ -11435,7 +11922,7 @@
           <w:color w:val="3A4A4C"/>
           <w:sz w:val="21"/>
         </w:rPr>
-        <w:t>Page 24 (UCF chart) — say "another video's sentence is worse than none" on 23.</w:t>
+        <w:t>Page 25 (UCF chart) — say "another video's sentence is worse than none" on 24.</w:t>
       </w:r>
     </w:p>
     <w:p>
@@ -11451,7 +11938,7 @@
           <w:color w:val="3A4A4C"/>
           <w:sz w:val="21"/>
         </w:rPr>
-        <w:t>Page 11 (evidence) — keep only if asked.</w:t>
+        <w:t>Page 12 (evidence) — keep only if asked.</w:t>
       </w:r>
     </w:p>
     <w:p>
@@ -11467,7 +11954,7 @@
           <w:color w:val="3A4A4C"/>
           <w:sz w:val="21"/>
         </w:rPr>
-        <w:t>Page 4: shorten to the one-line version plus the SETUP box and the "normal only" arrow.</w:t>
+        <w:t>Page 5: shorten to the one-line version plus the SETUP box and the "normal only" arrow.</w:t>
       </w:r>
     </w:p>
     <w:p>
@@ -11489,7 +11976,7 @@
           <w:color w:val="3A4A4C"/>
           <w:sz w:val="21"/>
         </w:rPr>
-        <w:t xml:space="preserve"> pages 4, 6, 12, 13, 16, 19, 22, 23, 26.</w:t>
+        <w:t xml:space="preserve"> pages 1, 5, 7, 13, 14, 17, 20, 23, 24, 27.</w:t>
       </w:r>
     </w:p>
     <w:p>

</xml_diff>

<commit_message>
Intro slide uses Wikimedia Commons photos (normal crossing / collision, CC BY-SA 2.0, credited on slide) and an illustrative score panel; script page 1 updated
</commit_message>
<xml_diff>
--- a/docs/06_presentations/DA-ZVAD_Presentation_Script_Oct2026.docx
+++ b/docs/06_presentations/DA-ZVAD_Presentation_Script_Oct2026.docx
@@ -3628,7 +3628,7 @@
           <w:color w:val="3A4A4C"/>
           <w:sz w:val="21"/>
         </w:rPr>
-        <w:t xml:space="preserve"> three pictures — an ordinary moment, the same camera with a cyclist circled, and the detector's score over time; three boxes underneath: What, How, Why it is hard.</w:t>
+        <w:t xml:space="preserve"> three pictures — a busy crossing (normal), a collision on a crossing (anomaly, circled), and a drawing of a detector's score over time; three boxes underneath: What, How, Why it is hard.</w:t>
       </w:r>
     </w:p>
     <w:p>
@@ -3639,7 +3639,7 @@
       <w:r>
         <w:drawing>
           <wp:inline xmlns:a="http://schemas.openxmlformats.org/drawingml/2006/main" xmlns:pic="http://schemas.openxmlformats.org/drawingml/2006/picture">
-            <wp:extent cx="5916295" cy="1927278"/>
+            <wp:extent cx="5916295" cy="1770406"/>
             <wp:docPr id="1" name="Picture 1"/>
             <wp:cNvGraphicFramePr>
               <a:graphicFrameLocks noChangeAspect="1"/>
@@ -3660,7 +3660,7 @@
                   <pic:spPr>
                     <a:xfrm>
                       <a:off x="0" y="0"/>
-                      <a:ext cx="5916295" cy="1927278"/>
+                      <a:ext cx="5916295" cy="1770406"/>
                     </a:xfrm>
                     <a:prstGeom prst="rect"/>
                   </pic:spPr>
@@ -3693,7 +3693,7 @@
           <w:color w:val="617274"/>
           <w:sz w:val="18"/>
         </w:rPr>
-        <w:t>What video anomaly detection is: an ordinary moment, the same camera with a cyclist, and the detector's score over time.</w:t>
+        <w:t>What video anomaly detection is: a normal crossing, a collision, and an illustration of the detector's score.</w:t>
       </w:r>
     </w:p>
     <w:p>
@@ -3742,7 +3742,7 @@
           <w:color w:val="141C1E"/>
           <w:sz w:val="21"/>
         </w:rPr>
-        <w:t xml:space="preserve"> On the left, an ordinary moment on a campus walkway. In the middle — the same camera — a cyclist riding where only people should walk. That's an anomaly. On the right is what a detector produces: </w:t>
+        <w:t xml:space="preserve"> On the left, a busy crossing — hundreds of people, all normal. In the middle, a collision on a crossing. That's an anomaly. On the right is what a detector produces: </w:t>
       </w:r>
       <w:r>
         <w:rPr>
@@ -3762,7 +3762,7 @@
           <w:color w:val="141C1E"/>
           <w:sz w:val="21"/>
         </w:rPr>
-        <w:t xml:space="preserve"> It stays low, rises during the anomaly — the shaded part — and crosses the alarm line."</w:t>
+        <w:t xml:space="preserve"> It stays low, then rises at the unusual moment and crosses the alarm line."</w:t>
       </w:r>
     </w:p>
     <w:p>
@@ -3823,7 +3823,7 @@
           <w:color w:val="3A4A4C"/>
           <w:sz w:val="21"/>
         </w:rPr>
-        <w:t xml:space="preserve"> left picture → the red circle → the curve rising inside the shaded part.</w:t>
+        <w:t xml:space="preserve"> the busy crossing → the red circle → the peak in the curve.</w:t>
       </w:r>
     </w:p>
     <w:p>
@@ -3851,7 +3851,7 @@
           <w:color w:val="3A4A4C"/>
           <w:sz w:val="21"/>
         </w:rPr>
-        <w:t>"Are these real frames?"</w:t>
+        <w:t>"Are these from your dataset?"</w:t>
       </w:r>
       <w:r>
         <w:rPr>
@@ -3861,7 +3861,7 @@
           <w:color w:val="3A4A4C"/>
           <w:sz w:val="21"/>
         </w:rPr>
-        <w:t xml:space="preserve"> — Yes. ShanghaiTech camera 01, clip 01_0014: frame 17 is the normal one, frame 95 the cyclist.</w:t>
+        <w:t xml:space="preserve"> — No. These two are public photos from Wikimedia Commons, used to explain the idea; the credit is at the bottom of the slide. My own data starts on page 9.</w:t>
       </w:r>
     </w:p>
     <w:p>
@@ -3877,7 +3877,7 @@
           <w:color w:val="3A4A4C"/>
           <w:sz w:val="21"/>
         </w:rPr>
-        <w:t>"Is the score curve from the same clip as the pictures?"</w:t>
+        <w:t>"Is the score curve real?"</w:t>
       </w:r>
       <w:r>
         <w:rPr>
@@ -3887,33 +3887,7 @@
           <w:color w:val="3A4A4C"/>
           <w:sz w:val="21"/>
         </w:rPr>
-        <w:t xml:space="preserve"> — No, it's clip 04_0004, the clip whose scores I keep saved for figures — the slide says so. Same benchmark, same detector.</w:t>
-      </w:r>
-    </w:p>
-    <w:p>
-      <w:pPr>
-        <w:pStyle w:val="ListBullet"/>
-        <w:spacing w:after="60"/>
-      </w:pPr>
-      <w:r>
-        <w:rPr>
-          <w:rFonts w:ascii="Georgia" w:hAnsi="Georgia"/>
-          <w:b w:val="0"/>
-          <w:i/>
-          <w:color w:val="3A4A4C"/>
-          <w:sz w:val="21"/>
-        </w:rPr>
-        <w:t>"Which version of the detector made that curve?"</w:t>
-      </w:r>
-      <w:r>
-        <w:rPr>
-          <w:rFonts w:ascii="Georgia" w:hAnsi="Georgia"/>
-          <w:b w:val="0"/>
-          <w:i w:val="0"/>
-          <w:color w:val="3A4A4C"/>
-          <w:sz w:val="21"/>
-        </w:rPr>
-        <w:t xml:space="preserve"> — The correct shared sentence, smoothed over 31 frames, scaled to 0–1 within the clip.</w:t>
+        <w:t xml:space="preserve"> — No, it's an illustration of what a detector outputs; the slide labels it. Real score curves from my system are on page 16.</w:t>
       </w:r>
     </w:p>
     <w:p>

</xml_diff>

<commit_message>
Next-steps slide: priority 1 reworded in plain language (re-check how the scene sentence helps); notes and script page 29 match
</commit_message>
<xml_diff>
--- a/docs/06_presentations/DA-ZVAD_Presentation_Script_Oct2026.docx
+++ b/docs/06_presentations/DA-ZVAD_Presentation_Script_Oct2026.docx
@@ -9991,7 +9991,7 @@
           <w:color w:val="141C1E"/>
           <w:sz w:val="21"/>
         </w:rPr>
-        <w:t>First, a measurement audit</w:t>
+        <w:t>First, I re-check how the scene sentence helps</w:t>
       </w:r>
       <w:r>
         <w:rPr>
@@ -10001,7 +10001,7 @@
           <w:color w:val="141C1E"/>
           <w:sz w:val="21"/>
         </w:rPr>
-        <w:t xml:space="preserve"> — it decides what the sentence really does. Then XD-Violence, LAVAD's second benchmark. Then </w:t>
+        <w:t xml:space="preserve"> — does it spot anomalies better, or mainly put all cameras on the same scale? Then XD-Violence, LAVAD's second benchmark. Then </w:t>
       </w:r>
       <w:r>
         <w:rPr>

</xml_diff>

<commit_message>
Handbook, slides and scripts: measurement audit and UCF-Crime bootstrap
- Handbook: new 6.7d 'How the sentence actually helps' (plain language, table,
  'scale, not sort', viva/interview lines); LAVAD wording now 'level with',
  backed by the bootstrap; summary table, five sentences, progress table and
  quiz (Q21-22) updated; Word copy rebuilt.
- Deck: result, UCF, comparison, limitations, next-steps and summary slides and
  their notes updated (audit done; 0.824 with its interval; 'first of six'
  removed). Layout check: no new overflow (remaining flags pre-date this change).
- Presentation script: pages 17, 24, 27-29, numbers appendix, five lines, never-
  say list; Word copy rebuilt. Older phase3_script_full.md line corrected.
</commit_message>
<xml_diff>
--- a/docs/06_presentations/DA-ZVAD_Presentation_Script_Oct2026.docx
+++ b/docs/06_presentations/DA-ZVAD_Presentation_Script_Oct2026.docx
@@ -7575,7 +7575,27 @@
           <w:color w:val="141C1E"/>
           <w:sz w:val="21"/>
         </w:rPr>
-        <w:t xml:space="preserve"> I'm auditing this properly next."</w:t>
+        <w:t xml:space="preserve"> I then measured it properly, with the rule for deciding written down before I ran it: </w:t>
+      </w:r>
+      <w:r>
+        <w:rPr>
+          <w:rFonts w:ascii="Georgia" w:hAnsi="Georgia"/>
+          <w:b/>
+          <w:i w:val="0"/>
+          <w:color w:val="141C1E"/>
+          <w:sz w:val="21"/>
+        </w:rPr>
+        <w:t>82% of this 0.105 is that shift.</w:t>
+      </w:r>
+      <w:r>
+        <w:rPr>
+          <w:rFonts w:ascii="Georgia" w:hAnsi="Georgia"/>
+          <w:b w:val="0"/>
+          <w:i w:val="0"/>
+          <w:color w:val="141C1E"/>
+          <w:sz w:val="21"/>
+        </w:rPr>
+        <w:t xml:space="preserve"> Scale, not sort."</w:t>
       </w:r>
     </w:p>
     <w:p>
@@ -7659,7 +7679,33 @@
           <w:color w:val="3A4A4C"/>
           <w:sz w:val="21"/>
         </w:rPr>
-        <w:t xml:space="preserve"> — My records of the within-video metric are at w=5; at that same setting the pooled gap is +0.100. Re-measuring at w=31 is the first step of the audit. I also have a second check at w=31: using the raw similarity instead of CLIP's softmax, the pooled gap is +0.017.</w:t>
+        <w:t xml:space="preserve"> — That was the first sign, at w=5. The audit then measured it at w=31: within-video change +0.006 again, and 82% of the 0.105 is a per-video shift. Without CLIP's softmax the same gap is only +0.017 — the softmax scale amplifies the shift.</w:t>
+      </w:r>
+    </w:p>
+    <w:p>
+      <w:pPr>
+        <w:pStyle w:val="ListBullet"/>
+        <w:spacing w:after="60"/>
+      </w:pPr>
+      <w:r>
+        <w:rPr>
+          <w:rFonts w:ascii="Georgia" w:hAnsi="Georgia"/>
+          <w:b w:val="0"/>
+          <w:i/>
+          <w:color w:val="3A4A4C"/>
+          <w:sz w:val="21"/>
+        </w:rPr>
+        <w:t>"How did you decide 'calibration' — after looking?"</w:t>
+      </w:r>
+      <w:r>
+        <w:rPr>
+          <w:rFonts w:ascii="Georgia" w:hAnsi="Georgia"/>
+          <w:b w:val="0"/>
+          <w:i w:val="0"/>
+          <w:color w:val="3A4A4C"/>
+          <w:sz w:val="21"/>
+        </w:rPr>
+        <w:t xml:space="preserve"> — No. The rule (at least two-thirds from the shift, and the within-video change at most a third of the gap) was committed in the script before it ran, and the script first had to reproduce all my published numbers — 52 checks.</w:t>
       </w:r>
     </w:p>
     <w:p>
@@ -9044,7 +9090,33 @@
           <w:color w:val="3A4A4C"/>
           <w:sz w:val="21"/>
         </w:rPr>
-        <w:t xml:space="preserve"> — Comparable or better. Same benchmark, and LAVAD also samples every 16th frame, but these are numbers from different papers.</w:t>
+        <w:t xml:space="preserve"> — Numerically yes, statistically no. I resampled my 290 videos 1,000 times: 0.824 ranges from 0.756 to 0.877, and I'm above LAVAD in only 73% of resamples. So: comparable.</w:t>
+      </w:r>
+    </w:p>
+    <w:p>
+      <w:pPr>
+        <w:pStyle w:val="ListBullet"/>
+        <w:spacing w:after="60"/>
+      </w:pPr>
+      <w:r>
+        <w:rPr>
+          <w:rFonts w:ascii="Georgia" w:hAnsi="Georgia"/>
+          <w:b w:val="0"/>
+          <w:i/>
+          <w:color w:val="3A4A4C"/>
+          <w:sz w:val="21"/>
+        </w:rPr>
+        <w:t>"Is the own-sentence result solid?"</w:t>
+      </w:r>
+      <w:r>
+        <w:rPr>
+          <w:rFonts w:ascii="Georgia" w:hAnsi="Georgia"/>
+          <w:b w:val="0"/>
+          <w:i w:val="0"/>
+          <w:color w:val="3A4A4C"/>
+          <w:sz w:val="21"/>
+        </w:rPr>
+        <w:t xml:space="preserve"> — Yes: +0.110, and its 95% interval is +0.069 to +0.157 — above zero in every resample.</w:t>
       </w:r>
     </w:p>
     <w:p>
@@ -9575,7 +9647,7 @@
           <w:color w:val="141C1E"/>
           <w:sz w:val="21"/>
         </w:rPr>
-        <w:t>On UCF-Crime, the most diverse benchmark, mine is first of six: 82.4, above LAVAD's 80.3 and AnyAnomaly's 80.7.</w:t>
+        <w:t>On UCF-Crime, the most diverse benchmark, I'm level with the best: 82.4 against LAVAD's 80.3 and AnyAnomaly's 80.7 — both inside my own 95% interval.</w:t>
       </w:r>
       <w:r>
         <w:rPr>
@@ -9866,7 +9938,7 @@
           <w:color w:val="141C1E"/>
           <w:sz w:val="21"/>
         </w:rPr>
-        <w:t>I haven't settled what the sentence actually does — inside a video it barely re-ranks frames.</w:t>
+        <w:t>The sentence mainly calibrates cameras — I measured that it barely re-ranks frames inside a video.</w:t>
       </w:r>
       <w:r>
         <w:rPr>
@@ -9991,7 +10063,7 @@
           <w:color w:val="141C1E"/>
           <w:sz w:val="21"/>
         </w:rPr>
-        <w:t>First, I re-check how the scene sentence helps</w:t>
+        <w:t>First, XD-Violence</w:t>
       </w:r>
       <w:r>
         <w:rPr>
@@ -10001,7 +10073,7 @@
           <w:color w:val="141C1E"/>
           <w:sz w:val="21"/>
         </w:rPr>
-        <w:t xml:space="preserve"> — does it spot anomalies better, or mainly put all cameras on the same scale? Then XD-Violence, LAVAD's second benchmark. Then </w:t>
+        <w:t xml:space="preserve">, LAVAD's second benchmark — already pre-registered, including a prediction that tests the calibration finding on new data. Then </w:t>
       </w:r>
       <w:r>
         <w:rPr>
@@ -10059,7 +10131,7 @@
           <w:color w:val="3A4A4C"/>
           <w:sz w:val="21"/>
         </w:rPr>
-        <w:t xml:space="preserve"> — The within-view check with a confidence range, the direction measurement, per-camera sentences by LLaVA, UCF-Crime with pre-registered predictions, and every citation checked against its source paper.</w:t>
+        <w:t xml:space="preserve"> — Per-camera sentences by LLaVA, UCF-Crime with pre-registered predictions and error bars, the measurement audit of how the sentence helps, and every citation checked against its source paper.</w:t>
       </w:r>
     </w:p>
     <w:p>
@@ -11108,7 +11180,143 @@
                 <w:color w:val="3A4A4C"/>
                 <w:sz w:val="18"/>
               </w:rPr>
-              <w:t>ShT, w=5 (pooled at w=5: +0.100)</w:t>
+              <w:t>ShT, w=5 and w=31 (pooled at w=5: +0.100)</w:t>
+            </w:r>
+          </w:p>
+        </w:tc>
+      </w:tr>
+      <w:tr>
+        <w:tc>
+          <w:tcPr>
+            <w:tcW w:type="dxa" w:w="3106"/>
+            <w:shd w:val="clear" w:fill="F5F7F7"/>
+          </w:tcPr>
+          <w:p>
+            <w:pPr>
+              <w:spacing w:before="60" w:after="60"/>
+            </w:pPr>
+            <w:r/>
+            <w:r>
+              <w:rPr>
+                <w:rFonts w:ascii="Segoe UI" w:hAnsi="Segoe UI"/>
+                <w:b w:val="0"/>
+                <w:i w:val="0"/>
+                <w:color w:val="3A4A4C"/>
+                <w:sz w:val="18"/>
+              </w:rPr>
+              <w:t>82% / 83% / 87%</w:t>
+            </w:r>
+          </w:p>
+        </w:tc>
+        <w:tc>
+          <w:tcPr>
+            <w:tcW w:type="dxa" w:w="3106"/>
+            <w:shd w:val="clear" w:fill="F5F7F7"/>
+          </w:tcPr>
+          <w:p>
+            <w:pPr>
+              <w:spacing w:before="60" w:after="60"/>
+            </w:pPr>
+            <w:r/>
+            <w:r>
+              <w:rPr>
+                <w:rFonts w:ascii="Segoe UI" w:hAnsi="Segoe UI"/>
+                <w:b w:val="0"/>
+                <w:i w:val="0"/>
+                <w:color w:val="3A4A4C"/>
+                <w:sz w:val="18"/>
+              </w:rPr>
+              <w:t>Share of each headline gap that is a per-video shift (calibration)</w:t>
+            </w:r>
+          </w:p>
+        </w:tc>
+        <w:tc>
+          <w:tcPr>
+            <w:tcW w:type="dxa" w:w="3106"/>
+            <w:shd w:val="clear" w:fill="F5F7F7"/>
+          </w:tcPr>
+          <w:p>
+            <w:pPr>
+              <w:spacing w:before="60" w:after="60"/>
+            </w:pPr>
+            <w:r/>
+            <w:r>
+              <w:rPr>
+                <w:rFonts w:ascii="Segoe UI" w:hAnsi="Segoe UI"/>
+                <w:b w:val="0"/>
+                <w:i w:val="0"/>
+                <w:color w:val="3A4A4C"/>
+                <w:sz w:val="18"/>
+              </w:rPr>
+              <w:t>ShT +0.105 / UCF vs none / UCF vs others'</w:t>
+            </w:r>
+          </w:p>
+        </w:tc>
+      </w:tr>
+      <w:tr>
+        <w:tc>
+          <w:tcPr>
+            <w:tcW w:type="dxa" w:w="3106"/>
+            <w:shd w:val="clear" w:fill="FFFFFF"/>
+          </w:tcPr>
+          <w:p>
+            <w:pPr>
+              <w:spacing w:before="60" w:after="60"/>
+            </w:pPr>
+            <w:r/>
+            <w:r>
+              <w:rPr>
+                <w:rFonts w:ascii="Segoe UI" w:hAnsi="Segoe UI"/>
+                <w:b w:val="0"/>
+                <w:i w:val="0"/>
+                <w:color w:val="3A4A4C"/>
+                <w:sz w:val="18"/>
+              </w:rPr>
+              <w:t>+0.017</w:t>
+            </w:r>
+          </w:p>
+        </w:tc>
+        <w:tc>
+          <w:tcPr>
+            <w:tcW w:type="dxa" w:w="3106"/>
+            <w:shd w:val="clear" w:fill="FFFFFF"/>
+          </w:tcPr>
+          <w:p>
+            <w:pPr>
+              <w:spacing w:before="60" w:after="60"/>
+            </w:pPr>
+            <w:r/>
+            <w:r>
+              <w:rPr>
+                <w:rFonts w:ascii="Segoe UI" w:hAnsi="Segoe UI"/>
+                <w:b w:val="0"/>
+                <w:i w:val="0"/>
+                <w:color w:val="3A4A4C"/>
+                <w:sz w:val="18"/>
+              </w:rPr>
+              <w:t>ShT correct − wrong without CLIP's softmax</w:t>
+            </w:r>
+          </w:p>
+        </w:tc>
+        <w:tc>
+          <w:tcPr>
+            <w:tcW w:type="dxa" w:w="3106"/>
+            <w:shd w:val="clear" w:fill="FFFFFF"/>
+          </w:tcPr>
+          <w:p>
+            <w:pPr>
+              <w:spacing w:before="60" w:after="60"/>
+            </w:pPr>
+            <w:r/>
+            <w:r>
+              <w:rPr>
+                <w:rFonts w:ascii="Segoe UI" w:hAnsi="Segoe UI"/>
+                <w:b w:val="0"/>
+                <w:i w:val="0"/>
+                <w:color w:val="3A4A4C"/>
+                <w:sz w:val="18"/>
+              </w:rPr>
+              <w:t>ShT, w=31</w:t>
             </w:r>
           </w:p>
         </w:tc>
@@ -11448,6 +11656,142 @@
                 <w:color w:val="3A4A4C"/>
                 <w:sz w:val="18"/>
               </w:rPr>
+              <w:t>raw pooled, w=5; 95% CI 0.756–0.877</w:t>
+            </w:r>
+          </w:p>
+        </w:tc>
+      </w:tr>
+      <w:tr>
+        <w:tc>
+          <w:tcPr>
+            <w:tcW w:type="dxa" w:w="3106"/>
+            <w:shd w:val="clear" w:fill="FFFFFF"/>
+          </w:tcPr>
+          <w:p>
+            <w:pPr>
+              <w:spacing w:before="60" w:after="60"/>
+            </w:pPr>
+            <w:r/>
+            <w:r>
+              <w:rPr>
+                <w:rFonts w:ascii="Segoe UI" w:hAnsi="Segoe UI"/>
+                <w:b w:val="0"/>
+                <w:i w:val="0"/>
+                <w:color w:val="3A4A4C"/>
+                <w:sz w:val="18"/>
+              </w:rPr>
+              <w:t>+0.110</w:t>
+            </w:r>
+          </w:p>
+        </w:tc>
+        <w:tc>
+          <w:tcPr>
+            <w:tcW w:type="dxa" w:w="3106"/>
+            <w:shd w:val="clear" w:fill="FFFFFF"/>
+          </w:tcPr>
+          <w:p>
+            <w:pPr>
+              <w:spacing w:before="60" w:after="60"/>
+            </w:pPr>
+            <w:r/>
+            <w:r>
+              <w:rPr>
+                <w:rFonts w:ascii="Segoe UI" w:hAnsi="Segoe UI"/>
+                <w:b w:val="0"/>
+                <w:i w:val="0"/>
+                <w:color w:val="3A4A4C"/>
+                <w:sz w:val="18"/>
+              </w:rPr>
+              <w:t>UCF-Crime own − other videos' sentences</w:t>
+            </w:r>
+          </w:p>
+        </w:tc>
+        <w:tc>
+          <w:tcPr>
+            <w:tcW w:type="dxa" w:w="3106"/>
+            <w:shd w:val="clear" w:fill="FFFFFF"/>
+          </w:tcPr>
+          <w:p>
+            <w:pPr>
+              <w:spacing w:before="60" w:after="60"/>
+            </w:pPr>
+            <w:r/>
+            <w:r>
+              <w:rPr>
+                <w:rFonts w:ascii="Segoe UI" w:hAnsi="Segoe UI"/>
+                <w:b w:val="0"/>
+                <w:i w:val="0"/>
+                <w:color w:val="3A4A4C"/>
+                <w:sz w:val="18"/>
+              </w:rPr>
+              <w:t>95% CI +0.069 to +0.157</w:t>
+            </w:r>
+          </w:p>
+        </w:tc>
+      </w:tr>
+      <w:tr>
+        <w:tc>
+          <w:tcPr>
+            <w:tcW w:type="dxa" w:w="3106"/>
+            <w:shd w:val="clear" w:fill="F5F7F7"/>
+          </w:tcPr>
+          <w:p>
+            <w:pPr>
+              <w:spacing w:before="60" w:after="60"/>
+            </w:pPr>
+            <w:r/>
+            <w:r>
+              <w:rPr>
+                <w:rFonts w:ascii="Segoe UI" w:hAnsi="Segoe UI"/>
+                <w:b w:val="0"/>
+                <w:i w:val="0"/>
+                <w:color w:val="3A4A4C"/>
+                <w:sz w:val="18"/>
+              </w:rPr>
+              <w:t>0.756 / 0.713</w:t>
+            </w:r>
+          </w:p>
+        </w:tc>
+        <w:tc>
+          <w:tcPr>
+            <w:tcW w:type="dxa" w:w="3106"/>
+            <w:shd w:val="clear" w:fill="F5F7F7"/>
+          </w:tcPr>
+          <w:p>
+            <w:pPr>
+              <w:spacing w:before="60" w:after="60"/>
+            </w:pPr>
+            <w:r/>
+            <w:r>
+              <w:rPr>
+                <w:rFonts w:ascii="Segoe UI" w:hAnsi="Segoe UI"/>
+                <w:b w:val="0"/>
+                <w:i w:val="0"/>
+                <w:color w:val="3A4A4C"/>
+                <w:sz w:val="18"/>
+              </w:rPr>
+              <w:t>UCF-Crime: none / other videos' sentences</w:t>
+            </w:r>
+          </w:p>
+        </w:tc>
+        <w:tc>
+          <w:tcPr>
+            <w:tcW w:type="dxa" w:w="3106"/>
+            <w:shd w:val="clear" w:fill="F5F7F7"/>
+          </w:tcPr>
+          <w:p>
+            <w:pPr>
+              <w:spacing w:before="60" w:after="60"/>
+            </w:pPr>
+            <w:r/>
+            <w:r>
+              <w:rPr>
+                <w:rFonts w:ascii="Segoe UI" w:hAnsi="Segoe UI"/>
+                <w:b w:val="0"/>
+                <w:i w:val="0"/>
+                <w:color w:val="3A4A4C"/>
+                <w:sz w:val="18"/>
+              </w:rPr>
               <w:t>raw pooled, w=5</w:t>
             </w:r>
           </w:p>
@@ -11472,7 +11816,7 @@
                 <w:color w:val="3A4A4C"/>
                 <w:sz w:val="18"/>
               </w:rPr>
-              <w:t>0.756 / 0.713</w:t>
+              <w:t>+0.096</w:t>
             </w:r>
           </w:p>
         </w:tc>
@@ -11494,7 +11838,7 @@
                 <w:color w:val="3A4A4C"/>
                 <w:sz w:val="18"/>
               </w:rPr>
-              <w:t>UCF-Crime: none / other videos' sentences</w:t>
+              <w:t>UCF-Crime own sentence − wrong domain</w:t>
             </w:r>
           </w:p>
         </w:tc>
@@ -11540,7 +11884,7 @@
                 <w:color w:val="3A4A4C"/>
                 <w:sz w:val="18"/>
               </w:rPr>
-              <w:t>+0.096</w:t>
+              <w:t>82.4 / 80.3 / 80.7</w:t>
             </w:r>
           </w:p>
         </w:tc>
@@ -11562,7 +11906,7 @@
                 <w:color w:val="3A4A4C"/>
                 <w:sz w:val="18"/>
               </w:rPr>
-              <w:t>UCF-Crime own sentence − wrong domain</w:t>
+              <w:t>Ours / LAVAD / AnyAnomaly on UCF-Crime</w:t>
             </w:r>
           </w:p>
         </w:tc>
@@ -11584,7 +11928,7 @@
                 <w:color w:val="3A4A4C"/>
                 <w:sz w:val="18"/>
               </w:rPr>
-              <w:t>raw pooled, w=5</w:t>
+              <w:t>papers' own metrics</w:t>
             </w:r>
           </w:p>
         </w:tc>
@@ -11608,7 +11952,7 @@
                 <w:color w:val="3A4A4C"/>
                 <w:sz w:val="18"/>
               </w:rPr>
-              <w:t>82.4 / 80.3 / 80.7</w:t>
+              <w:t>73.4 / 67.7</w:t>
             </w:r>
           </w:p>
         </w:tc>
@@ -11630,7 +11974,7 @@
                 <w:color w:val="3A4A4C"/>
                 <w:sz w:val="18"/>
               </w:rPr>
-              <w:t>Ours / LAVAD / AnyAnomaly on UCF-Crime</w:t>
+              <w:t>Ours on ShT / Avenue in the comparison</w:t>
             </w:r>
           </w:p>
         </w:tc>
@@ -11652,7 +11996,7 @@
                 <w:color w:val="3A4A4C"/>
                 <w:sz w:val="18"/>
               </w:rPr>
-              <w:t>papers' own metrics</w:t>
+              <w:t>shared correct sentence</w:t>
             </w:r>
           </w:p>
         </w:tc>
@@ -11676,7 +12020,7 @@
                 <w:color w:val="3A4A4C"/>
                 <w:sz w:val="18"/>
               </w:rPr>
-              <w:t>73.4 / 67.7</w:t>
+              <w:t>88.5%</w:t>
             </w:r>
           </w:p>
         </w:tc>
@@ -11698,7 +12042,7 @@
                 <w:color w:val="3A4A4C"/>
                 <w:sz w:val="18"/>
               </w:rPr>
-              <w:t>Ours on ShT / Avenue in the comparison</w:t>
+              <w:t>MVTec image AUROC (baseline only)</w:t>
             </w:r>
           </w:p>
         </w:tc>
@@ -11706,74 +12050,6 @@
           <w:tcPr>
             <w:tcW w:type="dxa" w:w="3106"/>
             <w:shd w:val="clear" w:fill="F5F7F7"/>
-          </w:tcPr>
-          <w:p>
-            <w:pPr>
-              <w:spacing w:before="60" w:after="60"/>
-            </w:pPr>
-            <w:r/>
-            <w:r>
-              <w:rPr>
-                <w:rFonts w:ascii="Segoe UI" w:hAnsi="Segoe UI"/>
-                <w:b w:val="0"/>
-                <w:i w:val="0"/>
-                <w:color w:val="3A4A4C"/>
-                <w:sz w:val="18"/>
-              </w:rPr>
-              <w:t>shared correct sentence</w:t>
-            </w:r>
-          </w:p>
-        </w:tc>
-      </w:tr>
-      <w:tr>
-        <w:tc>
-          <w:tcPr>
-            <w:tcW w:type="dxa" w:w="3106"/>
-            <w:shd w:val="clear" w:fill="FFFFFF"/>
-          </w:tcPr>
-          <w:p>
-            <w:pPr>
-              <w:spacing w:before="60" w:after="60"/>
-            </w:pPr>
-            <w:r/>
-            <w:r>
-              <w:rPr>
-                <w:rFonts w:ascii="Segoe UI" w:hAnsi="Segoe UI"/>
-                <w:b w:val="0"/>
-                <w:i w:val="0"/>
-                <w:color w:val="3A4A4C"/>
-                <w:sz w:val="18"/>
-              </w:rPr>
-              <w:t>88.5%</w:t>
-            </w:r>
-          </w:p>
-        </w:tc>
-        <w:tc>
-          <w:tcPr>
-            <w:tcW w:type="dxa" w:w="3106"/>
-            <w:shd w:val="clear" w:fill="FFFFFF"/>
-          </w:tcPr>
-          <w:p>
-            <w:pPr>
-              <w:spacing w:before="60" w:after="60"/>
-            </w:pPr>
-            <w:r/>
-            <w:r>
-              <w:rPr>
-                <w:rFonts w:ascii="Segoe UI" w:hAnsi="Segoe UI"/>
-                <w:b w:val="0"/>
-                <w:i w:val="0"/>
-                <w:color w:val="3A4A4C"/>
-                <w:sz w:val="18"/>
-              </w:rPr>
-              <w:t>MVTec image AUROC (baseline only)</w:t>
-            </w:r>
-          </w:p>
-        </w:tc>
-        <w:tc>
-          <w:tcPr>
-            <w:tcW w:type="dxa" w:w="3106"/>
-            <w:shd w:val="clear" w:fill="FFFFFF"/>
           </w:tcPr>
           <w:p>
             <w:pPr>
@@ -12022,7 +12298,7 @@
           <w:color w:val="3A4A4C"/>
           <w:sz w:val="21"/>
         </w:rPr>
-        <w:t>"0.824 on UCF-Crime with no training — comparable to or above the best training-free methods."</w:t>
+        <w:t>"0.824 on UCF-Crime with no training — level with the best training-free methods."</w:t>
       </w:r>
     </w:p>
     <w:p>
@@ -12054,7 +12330,7 @@
           <w:color w:val="3A4A4C"/>
           <w:sz w:val="21"/>
         </w:rPr>
-        <w:t>"It works by telling cameras apart — it needs several scenes, and I measured that rather than assuming it."</w:t>
+        <w:t>"It works mainly by putting cameras on one scale — scale, not sort — and I measured that with a rule fixed in advance."</w:t>
       </w:r>
     </w:p>
     <w:p>
@@ -12094,7 +12370,7 @@
           <w:color w:val="3A4A4C"/>
           <w:sz w:val="21"/>
         </w:rPr>
-        <w:t>"I beat LAVAD." → say "comparable or better".</w:t>
+        <w:t>"I beat LAVAD." → say "comparable — inside my own error bars".</w:t>
       </w:r>
     </w:p>
     <w:p>

</xml_diff>